<commit_message>
Docs:  updation of Excel file
</commit_message>
<xml_diff>
--- a/Excel - Cheat_Sheet.docx
+++ b/Excel - Cheat_Sheet.docx
@@ -1433,6 +1433,949 @@
         <w:t xml:space="preserve"> to extract data from Excel tables, pass it to an LLM agent via an API or workflow orchestration to reason over the text, and write structured inputs right back into Excel or SharePoint Document libraries.</w:t>
       </w:r>
     </w:p>
+    <w:p>
+      <w:pPr>
+        <w:rPr>
+          <w:b/>
+          <w:bCs/>
+        </w:rPr>
+      </w:pPr>
+    </w:p>
+    <w:p>
+      <w:pPr>
+        <w:rPr>
+          <w:b/>
+          <w:bCs/>
+        </w:rPr>
+      </w:pPr>
+    </w:p>
+    <w:p>
+      <w:pPr>
+        <w:pStyle w:val="Heading2"/>
+      </w:pPr>
+      <w:r>
+        <w:t>Part 1: Cell Mechanics &amp; Worksheet Fundamentals</w:t>
+      </w:r>
+    </w:p>
+    <w:p>
+      <w:pPr>
+        <w:rPr>
+          <w:b/>
+          <w:bCs/>
+        </w:rPr>
+      </w:pPr>
+      <w:r>
+        <w:rPr>
+          <w:b/>
+          <w:bCs/>
+        </w:rPr>
+        <w:t>1. What is the fundamental difference between a Formula and a Function in Excel?</w:t>
+      </w:r>
+    </w:p>
+    <w:p>
+      <w:pPr>
+        <w:numPr>
+          <w:ilvl w:val="0"/>
+          <w:numId w:val="26"/>
+        </w:numPr>
+      </w:pPr>
+      <w:r>
+        <w:rPr>
+          <w:b/>
+          <w:bCs/>
+        </w:rPr>
+        <w:t>Answer:</w:t>
+      </w:r>
+    </w:p>
+    <w:p>
+      <w:pPr>
+        <w:numPr>
+          <w:ilvl w:val="1"/>
+          <w:numId w:val="26"/>
+        </w:numPr>
+      </w:pPr>
+      <w:r>
+        <w:t xml:space="preserve">A </w:t>
+      </w:r>
+      <w:r>
+        <w:rPr>
+          <w:b/>
+          <w:bCs/>
+        </w:rPr>
+        <w:t>Formula</w:t>
+      </w:r>
+      <w:r>
+        <w:t xml:space="preserve"> is an expression written by the user to calculate a value (e.g., =A1+B1+C1). It always starts with an </w:t>
+      </w:r>
+      <w:proofErr w:type="gramStart"/>
+      <w:r>
+        <w:t>equals</w:t>
+      </w:r>
+      <w:proofErr w:type="gramEnd"/>
+      <w:r>
+        <w:t xml:space="preserve"> sign (=).</w:t>
+      </w:r>
+    </w:p>
+    <w:p>
+      <w:pPr>
+        <w:numPr>
+          <w:ilvl w:val="1"/>
+          <w:numId w:val="26"/>
+        </w:numPr>
+      </w:pPr>
+      <w:r>
+        <w:t xml:space="preserve">A </w:t>
+      </w:r>
+      <w:r>
+        <w:rPr>
+          <w:b/>
+          <w:bCs/>
+        </w:rPr>
+        <w:t>Function</w:t>
+      </w:r>
+      <w:r>
+        <w:t xml:space="preserve"> is a built-in, pre-defined formula already programmed into Excel to simplify complex operations (e.g., =</w:t>
+      </w:r>
+      <w:proofErr w:type="gramStart"/>
+      <w:r>
+        <w:t>SUM(</w:t>
+      </w:r>
+      <w:proofErr w:type="gramEnd"/>
+      <w:r>
+        <w:t>A1:C1)).</w:t>
+      </w:r>
+    </w:p>
+    <w:p>
+      <w:pPr>
+        <w:rPr>
+          <w:b/>
+          <w:bCs/>
+        </w:rPr>
+      </w:pPr>
+      <w:r>
+        <w:rPr>
+          <w:b/>
+          <w:bCs/>
+        </w:rPr>
+        <w:t>2. What are the four main components of a standard function syntax?</w:t>
+      </w:r>
+    </w:p>
+    <w:p>
+      <w:pPr>
+        <w:numPr>
+          <w:ilvl w:val="0"/>
+          <w:numId w:val="27"/>
+        </w:numPr>
+      </w:pPr>
+      <w:r>
+        <w:rPr>
+          <w:b/>
+          <w:bCs/>
+        </w:rPr>
+        <w:t>Answer:</w:t>
+      </w:r>
+    </w:p>
+    <w:p>
+      <w:pPr>
+        <w:numPr>
+          <w:ilvl w:val="1"/>
+          <w:numId w:val="27"/>
+        </w:numPr>
+      </w:pPr>
+      <w:r>
+        <w:lastRenderedPageBreak/>
+        <w:t xml:space="preserve">The </w:t>
+      </w:r>
+      <w:r>
+        <w:rPr>
+          <w:b/>
+          <w:bCs/>
+        </w:rPr>
+        <w:t>Equals Sign (=)</w:t>
+      </w:r>
+      <w:r>
+        <w:t xml:space="preserve"> tells Excel to expect a calculation.</w:t>
+      </w:r>
+    </w:p>
+    <w:p>
+      <w:pPr>
+        <w:numPr>
+          <w:ilvl w:val="1"/>
+          <w:numId w:val="27"/>
+        </w:numPr>
+      </w:pPr>
+      <w:r>
+        <w:t xml:space="preserve">The </w:t>
+      </w:r>
+      <w:r>
+        <w:rPr>
+          <w:b/>
+          <w:bCs/>
+        </w:rPr>
+        <w:t>Function Name</w:t>
+      </w:r>
+      <w:r>
+        <w:t xml:space="preserve"> (e.g., VLOOKUP, SUM, IF).</w:t>
+      </w:r>
+    </w:p>
+    <w:p>
+      <w:pPr>
+        <w:numPr>
+          <w:ilvl w:val="1"/>
+          <w:numId w:val="27"/>
+        </w:numPr>
+      </w:pPr>
+      <w:r>
+        <w:t xml:space="preserve">The </w:t>
+      </w:r>
+      <w:r>
+        <w:rPr>
+          <w:b/>
+          <w:bCs/>
+        </w:rPr>
+        <w:t>Parentheses ()</w:t>
+      </w:r>
+      <w:r>
+        <w:t xml:space="preserve"> which enclose the arguments.</w:t>
+      </w:r>
+    </w:p>
+    <w:p>
+      <w:pPr>
+        <w:numPr>
+          <w:ilvl w:val="1"/>
+          <w:numId w:val="27"/>
+        </w:numPr>
+      </w:pPr>
+      <w:r>
+        <w:t xml:space="preserve">The </w:t>
+      </w:r>
+      <w:r>
+        <w:rPr>
+          <w:b/>
+          <w:bCs/>
+        </w:rPr>
+        <w:t>Arguments</w:t>
+      </w:r>
+      <w:r>
+        <w:t xml:space="preserve"> separated by commas (the data or cell references the function needs to work).</w:t>
+      </w:r>
+    </w:p>
+    <w:p>
+      <w:pPr>
+        <w:rPr>
+          <w:b/>
+          <w:bCs/>
+        </w:rPr>
+      </w:pPr>
+      <w:r>
+        <w:rPr>
+          <w:b/>
+          <w:bCs/>
+        </w:rPr>
+        <w:t>3. What does the $ sign actually do in a cell reference?</w:t>
+      </w:r>
+    </w:p>
+    <w:p>
+      <w:pPr>
+        <w:numPr>
+          <w:ilvl w:val="0"/>
+          <w:numId w:val="28"/>
+        </w:numPr>
+      </w:pPr>
+      <w:r>
+        <w:rPr>
+          <w:b/>
+          <w:bCs/>
+        </w:rPr>
+        <w:t>Answer:</w:t>
+      </w:r>
+      <w:r>
+        <w:t xml:space="preserve"> The $ sign acts as </w:t>
+      </w:r>
+      <w:proofErr w:type="spellStart"/>
+      <w:proofErr w:type="gramStart"/>
+      <w:r>
+        <w:t>a</w:t>
+      </w:r>
+      <w:proofErr w:type="spellEnd"/>
+      <w:proofErr w:type="gramEnd"/>
+      <w:r>
+        <w:t xml:space="preserve"> anchor or physical lock. Placed before the column letter (e.g., $A1), it locks the column. Placed before the row number (e.g., A$1), it locks the row. Placed before both (e.g., $A$1), it locks the entire cell completely so it won't change when dragged or copied.</w:t>
+      </w:r>
+    </w:p>
+    <w:p>
+      <w:pPr>
+        <w:rPr>
+          <w:b/>
+          <w:bCs/>
+        </w:rPr>
+      </w:pPr>
+      <w:r>
+        <w:rPr>
+          <w:b/>
+          <w:bCs/>
+        </w:rPr>
+        <w:t>4. What happens to a formula containing relative references when you insert a new row above it?</w:t>
+      </w:r>
+    </w:p>
+    <w:p>
+      <w:pPr>
+        <w:numPr>
+          <w:ilvl w:val="0"/>
+          <w:numId w:val="29"/>
+        </w:numPr>
+      </w:pPr>
+      <w:r>
+        <w:rPr>
+          <w:b/>
+          <w:bCs/>
+        </w:rPr>
+        <w:t>Answer:</w:t>
+      </w:r>
+      <w:r>
+        <w:t xml:space="preserve"> Excel automatically updates the cell references in the formula to reflect their new position. For example, if your formula was =A2+B2 and you insert a row above row 2, your formula automatically shifts and changes to =A3+B3 so it continues pointing to the correct data.</w:t>
+      </w:r>
+    </w:p>
+    <w:p>
+      <w:pPr>
+        <w:rPr>
+          <w:b/>
+          <w:bCs/>
+        </w:rPr>
+      </w:pPr>
+      <w:r>
+        <w:rPr>
+          <w:b/>
+          <w:bCs/>
+        </w:rPr>
+        <w:t>5. What is the difference between an Excel Workbook and an Excel Worksheet?</w:t>
+      </w:r>
+    </w:p>
+    <w:p>
+      <w:pPr>
+        <w:numPr>
+          <w:ilvl w:val="0"/>
+          <w:numId w:val="30"/>
+        </w:numPr>
+      </w:pPr>
+      <w:r>
+        <w:rPr>
+          <w:b/>
+          <w:bCs/>
+        </w:rPr>
+        <w:t>Answer:</w:t>
+      </w:r>
+      <w:r>
+        <w:t xml:space="preserve"> A </w:t>
+      </w:r>
+      <w:r>
+        <w:rPr>
+          <w:b/>
+          <w:bCs/>
+        </w:rPr>
+        <w:t>Workbook</w:t>
+      </w:r>
+      <w:r>
+        <w:t xml:space="preserve"> is the entire separate Excel file (e.g., Project_Data.xlsx). A </w:t>
+      </w:r>
+      <w:r>
+        <w:rPr>
+          <w:b/>
+          <w:bCs/>
+        </w:rPr>
+        <w:t>Worksheet</w:t>
+      </w:r>
+      <w:r>
+        <w:t xml:space="preserve"> (or tab) is a single page or grid of cells contained </w:t>
+      </w:r>
+      <w:r>
+        <w:rPr>
+          <w:i/>
+          <w:iCs/>
+        </w:rPr>
+        <w:t>inside</w:t>
+      </w:r>
+      <w:r>
+        <w:t xml:space="preserve"> that workbook file. A workbook can hold multiple worksheets.</w:t>
+      </w:r>
+    </w:p>
+    <w:p>
+      <w:r>
+        <w:pict w14:anchorId="6CA279F5">
+          <v:rect id="_x0000_i1045" style="width:0;height:1.5pt" o:hralign="center" o:hrstd="t" o:hr="t" fillcolor="#a0a0a0" stroked="f"/>
+        </w:pict>
+      </w:r>
+    </w:p>
+    <w:p>
+      <w:pPr>
+        <w:pStyle w:val="Heading2"/>
+      </w:pPr>
+      <w:r>
+        <w:t>Part 2: Data Manipulation &amp; Structuring</w:t>
+      </w:r>
+    </w:p>
+    <w:p>
+      <w:pPr>
+        <w:rPr>
+          <w:b/>
+          <w:bCs/>
+        </w:rPr>
+      </w:pPr>
+      <w:r>
+        <w:rPr>
+          <w:b/>
+          <w:bCs/>
+        </w:rPr>
+        <w:t>6. What is the difference between Sort and Filter?</w:t>
+      </w:r>
+    </w:p>
+    <w:p>
+      <w:pPr>
+        <w:numPr>
+          <w:ilvl w:val="0"/>
+          <w:numId w:val="31"/>
+        </w:numPr>
+      </w:pPr>
+      <w:r>
+        <w:rPr>
+          <w:b/>
+          <w:bCs/>
+        </w:rPr>
+        <w:t>Answer:</w:t>
+      </w:r>
+    </w:p>
+    <w:p>
+      <w:pPr>
+        <w:numPr>
+          <w:ilvl w:val="1"/>
+          <w:numId w:val="31"/>
+        </w:numPr>
+      </w:pPr>
+      <w:r>
+        <w:rPr>
+          <w:b/>
+          <w:bCs/>
+        </w:rPr>
+        <w:t>Sorting</w:t>
+      </w:r>
+      <w:r>
+        <w:t xml:space="preserve"> rearranges the physical order of your rows (e.g., organizing names alphabetically from A to Z or numbers from highest to lowest). It does not hide any data.</w:t>
+      </w:r>
+    </w:p>
+    <w:p>
+      <w:pPr>
+        <w:numPr>
+          <w:ilvl w:val="1"/>
+          <w:numId w:val="31"/>
+        </w:numPr>
+      </w:pPr>
+      <w:r>
+        <w:rPr>
+          <w:b/>
+          <w:bCs/>
+        </w:rPr>
+        <w:t>Filtering</w:t>
+      </w:r>
+      <w:r>
+        <w:t xml:space="preserve"> temporarily hides rows that do not meet your specified criteria (e.g., showing only rows where the region is "North"), but it does not change the order of the remaining data.</w:t>
+      </w:r>
+    </w:p>
+    <w:p>
+      <w:pPr>
+        <w:rPr>
+          <w:b/>
+          <w:bCs/>
+        </w:rPr>
+      </w:pPr>
+      <w:r>
+        <w:rPr>
+          <w:b/>
+          <w:bCs/>
+        </w:rPr>
+        <w:t>7. What is the difference between "Clear" and "Delete" when handling cell data?</w:t>
+      </w:r>
+    </w:p>
+    <w:p>
+      <w:pPr>
+        <w:numPr>
+          <w:ilvl w:val="0"/>
+          <w:numId w:val="32"/>
+        </w:numPr>
+      </w:pPr>
+      <w:r>
+        <w:rPr>
+          <w:b/>
+          <w:bCs/>
+        </w:rPr>
+        <w:t>Answer:</w:t>
+      </w:r>
+    </w:p>
+    <w:p>
+      <w:pPr>
+        <w:numPr>
+          <w:ilvl w:val="1"/>
+          <w:numId w:val="32"/>
+        </w:numPr>
+      </w:pPr>
+      <w:r>
+        <w:rPr>
+          <w:b/>
+          <w:bCs/>
+        </w:rPr>
+        <w:t>Delete</w:t>
+      </w:r>
+      <w:r>
+        <w:t xml:space="preserve"> physically removes the cell, row, or column from the grid, causing the surrounding cells to shift up or left to fill the blank space.</w:t>
+      </w:r>
+    </w:p>
+    <w:p>
+      <w:pPr>
+        <w:numPr>
+          <w:ilvl w:val="1"/>
+          <w:numId w:val="32"/>
+        </w:numPr>
+      </w:pPr>
+      <w:r>
+        <w:rPr>
+          <w:b/>
+          <w:bCs/>
+        </w:rPr>
+        <w:t>Clear</w:t>
+      </w:r>
+      <w:r>
+        <w:t xml:space="preserve"> leaves the cell exactly where it is but wipes out its content, its formatting, or its hyperlinks, leaving an empty box behind.</w:t>
+      </w:r>
+    </w:p>
+    <w:p>
+      <w:pPr>
+        <w:rPr>
+          <w:b/>
+          <w:bCs/>
+        </w:rPr>
+      </w:pPr>
+      <w:r>
+        <w:rPr>
+          <w:b/>
+          <w:bCs/>
+        </w:rPr>
+        <w:t>8. How do you convert a formula's calculated output into a permanent, hardcoded value?</w:t>
+      </w:r>
+    </w:p>
+    <w:p>
+      <w:pPr>
+        <w:numPr>
+          <w:ilvl w:val="0"/>
+          <w:numId w:val="33"/>
+        </w:numPr>
+      </w:pPr>
+      <w:r>
+        <w:rPr>
+          <w:b/>
+          <w:bCs/>
+        </w:rPr>
+        <w:lastRenderedPageBreak/>
+        <w:t>Answer:</w:t>
+      </w:r>
+      <w:r>
+        <w:t xml:space="preserve"> Select and copy (Ctrl + C) the cells containing the formulas. Right-click the destination, look under </w:t>
+      </w:r>
+      <w:r>
+        <w:rPr>
+          <w:b/>
+          <w:bCs/>
+        </w:rPr>
+        <w:t>Paste Options</w:t>
+      </w:r>
+      <w:r>
+        <w:t xml:space="preserve">, and choose </w:t>
+      </w:r>
+      <w:r>
+        <w:rPr>
+          <w:b/>
+          <w:bCs/>
+        </w:rPr>
+        <w:t>Paste as Values</w:t>
+      </w:r>
+      <w:r>
+        <w:t xml:space="preserve"> (the icon with 123). This strips away the underlying formula and keeps only the static resulting text or number.</w:t>
+      </w:r>
+    </w:p>
+    <w:p>
+      <w:pPr>
+        <w:rPr>
+          <w:b/>
+          <w:bCs/>
+        </w:rPr>
+      </w:pPr>
+      <w:r>
+        <w:rPr>
+          <w:b/>
+          <w:bCs/>
+        </w:rPr>
+        <w:t>9. What is "Flash Fill" and how does it save time?</w:t>
+      </w:r>
+    </w:p>
+    <w:p>
+      <w:pPr>
+        <w:numPr>
+          <w:ilvl w:val="0"/>
+          <w:numId w:val="34"/>
+        </w:numPr>
+      </w:pPr>
+      <w:r>
+        <w:rPr>
+          <w:b/>
+          <w:bCs/>
+        </w:rPr>
+        <w:t>Answer:</w:t>
+      </w:r>
+      <w:r>
+        <w:t xml:space="preserve"> Flash Fill automatically senses a pattern when you begin entering data into a column next to an existing dataset. For example, if Column A has "John Smith" and you type "John" in Column B, Flash Fill can automatically extract the first names for the rest of the rows instantly when you hit Ctrl + E.</w:t>
+      </w:r>
+    </w:p>
+    <w:p>
+      <w:pPr>
+        <w:rPr>
+          <w:b/>
+          <w:bCs/>
+        </w:rPr>
+      </w:pPr>
+      <w:r>
+        <w:rPr>
+          <w:b/>
+          <w:bCs/>
+        </w:rPr>
+        <w:t>10. Why is it important to format your raw data range as an official "Excel Table" (Ctrl + T)?</w:t>
+      </w:r>
+    </w:p>
+    <w:p>
+      <w:pPr>
+        <w:numPr>
+          <w:ilvl w:val="0"/>
+          <w:numId w:val="35"/>
+        </w:numPr>
+      </w:pPr>
+      <w:r>
+        <w:rPr>
+          <w:b/>
+          <w:bCs/>
+        </w:rPr>
+        <w:t>Answer:</w:t>
+      </w:r>
+      <w:r>
+        <w:t xml:space="preserve"> Turning a raw range into an official Table introduces </w:t>
+      </w:r>
+      <w:r>
+        <w:rPr>
+          <w:b/>
+          <w:bCs/>
+        </w:rPr>
+        <w:t>dynamic arrays</w:t>
+      </w:r>
+      <w:r>
+        <w:t>. When you add new rows to the bottom of an Excel Table, all formulas, conditional formatting, and data validations automatically extend to the new rows. Furthermore, any Pivot Tables pointing to that Table will capture the new rows automatically upon refresh without needing to re-adjust the data source range.</w:t>
+      </w:r>
+    </w:p>
+    <w:p>
+      <w:r>
+        <w:pict w14:anchorId="302DABD5">
+          <v:rect id="_x0000_i1046" style="width:0;height:1.5pt" o:hralign="center" o:hrstd="t" o:hr="t" fillcolor="#a0a0a0" stroked="f"/>
+        </w:pict>
+      </w:r>
+    </w:p>
+    <w:p>
+      <w:pPr>
+        <w:pStyle w:val="Heading2"/>
+      </w:pPr>
+      <w:r>
+        <w:t>Part 3: Reporting, Pivots, &amp; Chart Fundamentals</w:t>
+      </w:r>
+    </w:p>
+    <w:p>
+      <w:pPr>
+        <w:rPr>
+          <w:b/>
+          <w:bCs/>
+        </w:rPr>
+      </w:pPr>
+      <w:r>
+        <w:rPr>
+          <w:b/>
+          <w:bCs/>
+        </w:rPr>
+        <w:t>11. What is the direct relationship between a Pivot Table and a Pivot Chart?</w:t>
+      </w:r>
+    </w:p>
+    <w:p>
+      <w:pPr>
+        <w:numPr>
+          <w:ilvl w:val="0"/>
+          <w:numId w:val="36"/>
+        </w:numPr>
+      </w:pPr>
+      <w:r>
+        <w:rPr>
+          <w:b/>
+          <w:bCs/>
+        </w:rPr>
+        <w:t>Answer:</w:t>
+      </w:r>
+      <w:r>
+        <w:t xml:space="preserve"> A Pivot Chart is the visual representation of the summarized data inside its linked Pivot Table. They are directly connected: if you filter, sort, or change the fields inside the Pivot Table, the Pivot Chart updates dynamically in real-time to match. If you change a filter on the chart, the table updates too.</w:t>
+      </w:r>
+    </w:p>
+    <w:p>
+      <w:pPr>
+        <w:rPr>
+          <w:b/>
+          <w:bCs/>
+        </w:rPr>
+      </w:pPr>
+      <w:r>
+        <w:rPr>
+          <w:b/>
+          <w:bCs/>
+        </w:rPr>
+        <w:t>12. When would you use a Bar Chart versus a Line Chart?</w:t>
+      </w:r>
+    </w:p>
+    <w:p>
+      <w:pPr>
+        <w:numPr>
+          <w:ilvl w:val="0"/>
+          <w:numId w:val="37"/>
+        </w:numPr>
+      </w:pPr>
+      <w:r>
+        <w:rPr>
+          <w:b/>
+          <w:bCs/>
+        </w:rPr>
+        <w:t>Answer:</w:t>
+      </w:r>
+    </w:p>
+    <w:p>
+      <w:pPr>
+        <w:numPr>
+          <w:ilvl w:val="1"/>
+          <w:numId w:val="37"/>
+        </w:numPr>
+      </w:pPr>
+      <w:r>
+        <w:t xml:space="preserve">A </w:t>
+      </w:r>
+      <w:r>
+        <w:rPr>
+          <w:b/>
+          <w:bCs/>
+        </w:rPr>
+        <w:t>Line Chart</w:t>
+      </w:r>
+      <w:r>
+        <w:t xml:space="preserve"> is ideal for displaying trends over a continuous period of time (e.g., tracking monthly API requests or project expenses over a year).</w:t>
+      </w:r>
+    </w:p>
+    <w:p>
+      <w:pPr>
+        <w:numPr>
+          <w:ilvl w:val="1"/>
+          <w:numId w:val="37"/>
+        </w:numPr>
+      </w:pPr>
+      <w:r>
+        <w:t xml:space="preserve">A </w:t>
+      </w:r>
+      <w:r>
+        <w:rPr>
+          <w:b/>
+          <w:bCs/>
+        </w:rPr>
+        <w:t>Bar/Column Chart</w:t>
+      </w:r>
+      <w:r>
+        <w:t xml:space="preserve"> is best used for comparing distinct, independent categories against one another at a specific point in time (e.g., comparing sales performance across 5 different team members).</w:t>
+      </w:r>
+    </w:p>
+    <w:p>
+      <w:pPr>
+        <w:rPr>
+          <w:b/>
+          <w:bCs/>
+        </w:rPr>
+      </w:pPr>
+      <w:r>
+        <w:rPr>
+          <w:b/>
+          <w:bCs/>
+        </w:rPr>
+        <w:t>13. What are "Calculated Fields" inside a Pivot Table?</w:t>
+      </w:r>
+    </w:p>
+    <w:p>
+      <w:pPr>
+        <w:numPr>
+          <w:ilvl w:val="0"/>
+          <w:numId w:val="38"/>
+        </w:numPr>
+      </w:pPr>
+      <w:r>
+        <w:rPr>
+          <w:b/>
+          <w:bCs/>
+        </w:rPr>
+        <w:t>Answer:</w:t>
+      </w:r>
+      <w:r>
+        <w:t xml:space="preserve"> A Calculated Field allows you to insert a custom mathematical operation directly into the Pivot Table engine using existing source columns. For example, if your Pivot Table has a "Revenue" field and a "Cost" field, you can create a calculated field called "Profit" using the formula =Revenue - Cost without changing your original underlying data sheet.</w:t>
+      </w:r>
+    </w:p>
+    <w:p>
+      <w:pPr>
+        <w:rPr>
+          <w:b/>
+          <w:bCs/>
+        </w:rPr>
+      </w:pPr>
+      <w:r>
+        <w:rPr>
+          <w:b/>
+          <w:bCs/>
+        </w:rPr>
+        <w:t>14. What are the 4 functional quadrants of a Pivot Table panel layout?</w:t>
+      </w:r>
+    </w:p>
+    <w:p>
+      <w:pPr>
+        <w:numPr>
+          <w:ilvl w:val="0"/>
+          <w:numId w:val="39"/>
+        </w:numPr>
+      </w:pPr>
+      <w:r>
+        <w:rPr>
+          <w:b/>
+          <w:bCs/>
+        </w:rPr>
+        <w:t>Answer:</w:t>
+      </w:r>
+    </w:p>
+    <w:p>
+      <w:pPr>
+        <w:numPr>
+          <w:ilvl w:val="1"/>
+          <w:numId w:val="39"/>
+        </w:numPr>
+      </w:pPr>
+      <w:r>
+        <w:rPr>
+          <w:b/>
+          <w:bCs/>
+        </w:rPr>
+        <w:t>Filters:</w:t>
+      </w:r>
+      <w:r>
+        <w:t xml:space="preserve"> Limits the data displayed across the entire table.</w:t>
+      </w:r>
+    </w:p>
+    <w:p>
+      <w:pPr>
+        <w:numPr>
+          <w:ilvl w:val="1"/>
+          <w:numId w:val="39"/>
+        </w:numPr>
+      </w:pPr>
+      <w:r>
+        <w:rPr>
+          <w:b/>
+          <w:bCs/>
+        </w:rPr>
+        <w:t>Columns:</w:t>
+      </w:r>
+      <w:r>
+        <w:t xml:space="preserve"> Displays data fields horizontally across the top.</w:t>
+      </w:r>
+    </w:p>
+    <w:p>
+      <w:pPr>
+        <w:numPr>
+          <w:ilvl w:val="1"/>
+          <w:numId w:val="39"/>
+        </w:numPr>
+      </w:pPr>
+      <w:r>
+        <w:rPr>
+          <w:b/>
+          <w:bCs/>
+        </w:rPr>
+        <w:lastRenderedPageBreak/>
+        <w:t>Rows:</w:t>
+      </w:r>
+      <w:r>
+        <w:t xml:space="preserve"> Organizes data fields vertically down the left side.</w:t>
+      </w:r>
+    </w:p>
+    <w:p>
+      <w:pPr>
+        <w:numPr>
+          <w:ilvl w:val="1"/>
+          <w:numId w:val="39"/>
+        </w:numPr>
+      </w:pPr>
+      <w:r>
+        <w:rPr>
+          <w:b/>
+          <w:bCs/>
+        </w:rPr>
+        <w:t>Values:</w:t>
+      </w:r>
+      <w:r>
+        <w:t xml:space="preserve"> The numerical data being calculated (summed, averaged, counted).</w:t>
+      </w:r>
+    </w:p>
+    <w:p>
+      <w:pPr>
+        <w:rPr>
+          <w:b/>
+          <w:bCs/>
+        </w:rPr>
+      </w:pPr>
+      <w:r>
+        <w:rPr>
+          <w:b/>
+          <w:bCs/>
+        </w:rPr>
+        <w:t>15. How do you change a Pivot Table from calculating the "SUM" of a column to the "COUNT" of a column?</w:t>
+      </w:r>
+    </w:p>
+    <w:p>
+      <w:pPr>
+        <w:numPr>
+          <w:ilvl w:val="0"/>
+          <w:numId w:val="40"/>
+        </w:numPr>
+      </w:pPr>
+      <w:r>
+        <w:rPr>
+          <w:b/>
+          <w:bCs/>
+        </w:rPr>
+        <w:t>Answer:</w:t>
+      </w:r>
+      <w:r>
+        <w:t xml:space="preserve"> Right-click on any value inside the Pivot Table field you want to modify, select </w:t>
+      </w:r>
+      <w:r>
+        <w:rPr>
+          <w:b/>
+          <w:bCs/>
+        </w:rPr>
+        <w:t>Value Field Settings</w:t>
+      </w:r>
+      <w:r>
+        <w:t>, and switch the calculation type from Sum to Count (or Average, Max, Min) from the provided selection list.</w:t>
+      </w:r>
+    </w:p>
+    <w:p/>
     <w:p/>
     <w:sectPr>
       <w:pgSz w:w="11906" w:h="16838"/>
@@ -1596,6 +2539,304 @@
     </w:lvl>
   </w:abstractNum>
   <w:abstractNum w:abstractNumId="1" w15:restartNumberingAfterBreak="0">
+    <w:nsid w:val="06D42C49"/>
+    <w:multiLevelType w:val="multilevel"/>
+    <w:tmpl w:val="6C34875E"/>
+    <w:lvl w:ilvl="0">
+      <w:start w:val="1"/>
+      <w:numFmt w:val="bullet"/>
+      <w:lvlText w:val=""/>
+      <w:lvlJc w:val="left"/>
+      <w:pPr>
+        <w:tabs>
+          <w:tab w:val="num" w:pos="720"/>
+        </w:tabs>
+        <w:ind w:left="720" w:hanging="360"/>
+      </w:pPr>
+      <w:rPr>
+        <w:rFonts w:ascii="Symbol" w:hAnsi="Symbol" w:hint="default"/>
+        <w:sz w:val="20"/>
+      </w:rPr>
+    </w:lvl>
+    <w:lvl w:ilvl="1" w:tentative="1">
+      <w:start w:val="1"/>
+      <w:numFmt w:val="bullet"/>
+      <w:lvlText w:val="o"/>
+      <w:lvlJc w:val="left"/>
+      <w:pPr>
+        <w:tabs>
+          <w:tab w:val="num" w:pos="1440"/>
+        </w:tabs>
+        <w:ind w:left="1440" w:hanging="360"/>
+      </w:pPr>
+      <w:rPr>
+        <w:rFonts w:ascii="Courier New" w:hAnsi="Courier New" w:hint="default"/>
+        <w:sz w:val="20"/>
+      </w:rPr>
+    </w:lvl>
+    <w:lvl w:ilvl="2" w:tentative="1">
+      <w:start w:val="1"/>
+      <w:numFmt w:val="bullet"/>
+      <w:lvlText w:val=""/>
+      <w:lvlJc w:val="left"/>
+      <w:pPr>
+        <w:tabs>
+          <w:tab w:val="num" w:pos="2160"/>
+        </w:tabs>
+        <w:ind w:left="2160" w:hanging="360"/>
+      </w:pPr>
+      <w:rPr>
+        <w:rFonts w:ascii="Wingdings" w:hAnsi="Wingdings" w:hint="default"/>
+        <w:sz w:val="20"/>
+      </w:rPr>
+    </w:lvl>
+    <w:lvl w:ilvl="3" w:tentative="1">
+      <w:start w:val="1"/>
+      <w:numFmt w:val="bullet"/>
+      <w:lvlText w:val=""/>
+      <w:lvlJc w:val="left"/>
+      <w:pPr>
+        <w:tabs>
+          <w:tab w:val="num" w:pos="2880"/>
+        </w:tabs>
+        <w:ind w:left="2880" w:hanging="360"/>
+      </w:pPr>
+      <w:rPr>
+        <w:rFonts w:ascii="Wingdings" w:hAnsi="Wingdings" w:hint="default"/>
+        <w:sz w:val="20"/>
+      </w:rPr>
+    </w:lvl>
+    <w:lvl w:ilvl="4" w:tentative="1">
+      <w:start w:val="1"/>
+      <w:numFmt w:val="bullet"/>
+      <w:lvlText w:val=""/>
+      <w:lvlJc w:val="left"/>
+      <w:pPr>
+        <w:tabs>
+          <w:tab w:val="num" w:pos="3600"/>
+        </w:tabs>
+        <w:ind w:left="3600" w:hanging="360"/>
+      </w:pPr>
+      <w:rPr>
+        <w:rFonts w:ascii="Wingdings" w:hAnsi="Wingdings" w:hint="default"/>
+        <w:sz w:val="20"/>
+      </w:rPr>
+    </w:lvl>
+    <w:lvl w:ilvl="5" w:tentative="1">
+      <w:start w:val="1"/>
+      <w:numFmt w:val="bullet"/>
+      <w:lvlText w:val=""/>
+      <w:lvlJc w:val="left"/>
+      <w:pPr>
+        <w:tabs>
+          <w:tab w:val="num" w:pos="4320"/>
+        </w:tabs>
+        <w:ind w:left="4320" w:hanging="360"/>
+      </w:pPr>
+      <w:rPr>
+        <w:rFonts w:ascii="Wingdings" w:hAnsi="Wingdings" w:hint="default"/>
+        <w:sz w:val="20"/>
+      </w:rPr>
+    </w:lvl>
+    <w:lvl w:ilvl="6" w:tentative="1">
+      <w:start w:val="1"/>
+      <w:numFmt w:val="bullet"/>
+      <w:lvlText w:val=""/>
+      <w:lvlJc w:val="left"/>
+      <w:pPr>
+        <w:tabs>
+          <w:tab w:val="num" w:pos="5040"/>
+        </w:tabs>
+        <w:ind w:left="5040" w:hanging="360"/>
+      </w:pPr>
+      <w:rPr>
+        <w:rFonts w:ascii="Wingdings" w:hAnsi="Wingdings" w:hint="default"/>
+        <w:sz w:val="20"/>
+      </w:rPr>
+    </w:lvl>
+    <w:lvl w:ilvl="7" w:tentative="1">
+      <w:start w:val="1"/>
+      <w:numFmt w:val="bullet"/>
+      <w:lvlText w:val=""/>
+      <w:lvlJc w:val="left"/>
+      <w:pPr>
+        <w:tabs>
+          <w:tab w:val="num" w:pos="5760"/>
+        </w:tabs>
+        <w:ind w:left="5760" w:hanging="360"/>
+      </w:pPr>
+      <w:rPr>
+        <w:rFonts w:ascii="Wingdings" w:hAnsi="Wingdings" w:hint="default"/>
+        <w:sz w:val="20"/>
+      </w:rPr>
+    </w:lvl>
+    <w:lvl w:ilvl="8" w:tentative="1">
+      <w:start w:val="1"/>
+      <w:numFmt w:val="bullet"/>
+      <w:lvlText w:val=""/>
+      <w:lvlJc w:val="left"/>
+      <w:pPr>
+        <w:tabs>
+          <w:tab w:val="num" w:pos="6480"/>
+        </w:tabs>
+        <w:ind w:left="6480" w:hanging="360"/>
+      </w:pPr>
+      <w:rPr>
+        <w:rFonts w:ascii="Wingdings" w:hAnsi="Wingdings" w:hint="default"/>
+        <w:sz w:val="20"/>
+      </w:rPr>
+    </w:lvl>
+  </w:abstractNum>
+  <w:abstractNum w:abstractNumId="2" w15:restartNumberingAfterBreak="0">
+    <w:nsid w:val="09D96AB3"/>
+    <w:multiLevelType w:val="multilevel"/>
+    <w:tmpl w:val="4BA676FC"/>
+    <w:lvl w:ilvl="0">
+      <w:start w:val="1"/>
+      <w:numFmt w:val="bullet"/>
+      <w:lvlText w:val=""/>
+      <w:lvlJc w:val="left"/>
+      <w:pPr>
+        <w:tabs>
+          <w:tab w:val="num" w:pos="720"/>
+        </w:tabs>
+        <w:ind w:left="720" w:hanging="360"/>
+      </w:pPr>
+      <w:rPr>
+        <w:rFonts w:ascii="Symbol" w:hAnsi="Symbol" w:hint="default"/>
+        <w:sz w:val="20"/>
+      </w:rPr>
+    </w:lvl>
+    <w:lvl w:ilvl="1" w:tentative="1">
+      <w:start w:val="1"/>
+      <w:numFmt w:val="bullet"/>
+      <w:lvlText w:val="o"/>
+      <w:lvlJc w:val="left"/>
+      <w:pPr>
+        <w:tabs>
+          <w:tab w:val="num" w:pos="1440"/>
+        </w:tabs>
+        <w:ind w:left="1440" w:hanging="360"/>
+      </w:pPr>
+      <w:rPr>
+        <w:rFonts w:ascii="Courier New" w:hAnsi="Courier New" w:hint="default"/>
+        <w:sz w:val="20"/>
+      </w:rPr>
+    </w:lvl>
+    <w:lvl w:ilvl="2" w:tentative="1">
+      <w:start w:val="1"/>
+      <w:numFmt w:val="bullet"/>
+      <w:lvlText w:val=""/>
+      <w:lvlJc w:val="left"/>
+      <w:pPr>
+        <w:tabs>
+          <w:tab w:val="num" w:pos="2160"/>
+        </w:tabs>
+        <w:ind w:left="2160" w:hanging="360"/>
+      </w:pPr>
+      <w:rPr>
+        <w:rFonts w:ascii="Wingdings" w:hAnsi="Wingdings" w:hint="default"/>
+        <w:sz w:val="20"/>
+      </w:rPr>
+    </w:lvl>
+    <w:lvl w:ilvl="3" w:tentative="1">
+      <w:start w:val="1"/>
+      <w:numFmt w:val="bullet"/>
+      <w:lvlText w:val=""/>
+      <w:lvlJc w:val="left"/>
+      <w:pPr>
+        <w:tabs>
+          <w:tab w:val="num" w:pos="2880"/>
+        </w:tabs>
+        <w:ind w:left="2880" w:hanging="360"/>
+      </w:pPr>
+      <w:rPr>
+        <w:rFonts w:ascii="Wingdings" w:hAnsi="Wingdings" w:hint="default"/>
+        <w:sz w:val="20"/>
+      </w:rPr>
+    </w:lvl>
+    <w:lvl w:ilvl="4" w:tentative="1">
+      <w:start w:val="1"/>
+      <w:numFmt w:val="bullet"/>
+      <w:lvlText w:val=""/>
+      <w:lvlJc w:val="left"/>
+      <w:pPr>
+        <w:tabs>
+          <w:tab w:val="num" w:pos="3600"/>
+        </w:tabs>
+        <w:ind w:left="3600" w:hanging="360"/>
+      </w:pPr>
+      <w:rPr>
+        <w:rFonts w:ascii="Wingdings" w:hAnsi="Wingdings" w:hint="default"/>
+        <w:sz w:val="20"/>
+      </w:rPr>
+    </w:lvl>
+    <w:lvl w:ilvl="5" w:tentative="1">
+      <w:start w:val="1"/>
+      <w:numFmt w:val="bullet"/>
+      <w:lvlText w:val=""/>
+      <w:lvlJc w:val="left"/>
+      <w:pPr>
+        <w:tabs>
+          <w:tab w:val="num" w:pos="4320"/>
+        </w:tabs>
+        <w:ind w:left="4320" w:hanging="360"/>
+      </w:pPr>
+      <w:rPr>
+        <w:rFonts w:ascii="Wingdings" w:hAnsi="Wingdings" w:hint="default"/>
+        <w:sz w:val="20"/>
+      </w:rPr>
+    </w:lvl>
+    <w:lvl w:ilvl="6" w:tentative="1">
+      <w:start w:val="1"/>
+      <w:numFmt w:val="bullet"/>
+      <w:lvlText w:val=""/>
+      <w:lvlJc w:val="left"/>
+      <w:pPr>
+        <w:tabs>
+          <w:tab w:val="num" w:pos="5040"/>
+        </w:tabs>
+        <w:ind w:left="5040" w:hanging="360"/>
+      </w:pPr>
+      <w:rPr>
+        <w:rFonts w:ascii="Wingdings" w:hAnsi="Wingdings" w:hint="default"/>
+        <w:sz w:val="20"/>
+      </w:rPr>
+    </w:lvl>
+    <w:lvl w:ilvl="7" w:tentative="1">
+      <w:start w:val="1"/>
+      <w:numFmt w:val="bullet"/>
+      <w:lvlText w:val=""/>
+      <w:lvlJc w:val="left"/>
+      <w:pPr>
+        <w:tabs>
+          <w:tab w:val="num" w:pos="5760"/>
+        </w:tabs>
+        <w:ind w:left="5760" w:hanging="360"/>
+      </w:pPr>
+      <w:rPr>
+        <w:rFonts w:ascii="Wingdings" w:hAnsi="Wingdings" w:hint="default"/>
+        <w:sz w:val="20"/>
+      </w:rPr>
+    </w:lvl>
+    <w:lvl w:ilvl="8" w:tentative="1">
+      <w:start w:val="1"/>
+      <w:numFmt w:val="bullet"/>
+      <w:lvlText w:val=""/>
+      <w:lvlJc w:val="left"/>
+      <w:pPr>
+        <w:tabs>
+          <w:tab w:val="num" w:pos="6480"/>
+        </w:tabs>
+        <w:ind w:left="6480" w:hanging="360"/>
+      </w:pPr>
+      <w:rPr>
+        <w:rFonts w:ascii="Wingdings" w:hAnsi="Wingdings" w:hint="default"/>
+        <w:sz w:val="20"/>
+      </w:rPr>
+    </w:lvl>
+  </w:abstractNum>
+  <w:abstractNum w:abstractNumId="3" w15:restartNumberingAfterBreak="0">
     <w:nsid w:val="0B39468A"/>
     <w:multiLevelType w:val="multilevel"/>
     <w:tmpl w:val="CB5E9098"/>
@@ -1744,7 +2985,7 @@
       </w:rPr>
     </w:lvl>
   </w:abstractNum>
-  <w:abstractNum w:abstractNumId="2" w15:restartNumberingAfterBreak="0">
+  <w:abstractNum w:abstractNumId="4" w15:restartNumberingAfterBreak="0">
     <w:nsid w:val="106D47A1"/>
     <w:multiLevelType w:val="multilevel"/>
     <w:tmpl w:val="739C8080"/>
@@ -1893,7 +3134,7 @@
       </w:rPr>
     </w:lvl>
   </w:abstractNum>
-  <w:abstractNum w:abstractNumId="3" w15:restartNumberingAfterBreak="0">
+  <w:abstractNum w:abstractNumId="5" w15:restartNumberingAfterBreak="0">
     <w:nsid w:val="10E54E00"/>
     <w:multiLevelType w:val="multilevel"/>
     <w:tmpl w:val="4B9631F8"/>
@@ -2042,7 +3283,156 @@
       </w:rPr>
     </w:lvl>
   </w:abstractNum>
-  <w:abstractNum w:abstractNumId="4" w15:restartNumberingAfterBreak="0">
+  <w:abstractNum w:abstractNumId="6" w15:restartNumberingAfterBreak="0">
+    <w:nsid w:val="13C94978"/>
+    <w:multiLevelType w:val="multilevel"/>
+    <w:tmpl w:val="63E603D8"/>
+    <w:lvl w:ilvl="0">
+      <w:start w:val="1"/>
+      <w:numFmt w:val="bullet"/>
+      <w:lvlText w:val=""/>
+      <w:lvlJc w:val="left"/>
+      <w:pPr>
+        <w:tabs>
+          <w:tab w:val="num" w:pos="720"/>
+        </w:tabs>
+        <w:ind w:left="720" w:hanging="360"/>
+      </w:pPr>
+      <w:rPr>
+        <w:rFonts w:ascii="Symbol" w:hAnsi="Symbol" w:hint="default"/>
+        <w:sz w:val="20"/>
+      </w:rPr>
+    </w:lvl>
+    <w:lvl w:ilvl="1" w:tentative="1">
+      <w:start w:val="1"/>
+      <w:numFmt w:val="bullet"/>
+      <w:lvlText w:val="o"/>
+      <w:lvlJc w:val="left"/>
+      <w:pPr>
+        <w:tabs>
+          <w:tab w:val="num" w:pos="1440"/>
+        </w:tabs>
+        <w:ind w:left="1440" w:hanging="360"/>
+      </w:pPr>
+      <w:rPr>
+        <w:rFonts w:ascii="Courier New" w:hAnsi="Courier New" w:hint="default"/>
+        <w:sz w:val="20"/>
+      </w:rPr>
+    </w:lvl>
+    <w:lvl w:ilvl="2" w:tentative="1">
+      <w:start w:val="1"/>
+      <w:numFmt w:val="bullet"/>
+      <w:lvlText w:val=""/>
+      <w:lvlJc w:val="left"/>
+      <w:pPr>
+        <w:tabs>
+          <w:tab w:val="num" w:pos="2160"/>
+        </w:tabs>
+        <w:ind w:left="2160" w:hanging="360"/>
+      </w:pPr>
+      <w:rPr>
+        <w:rFonts w:ascii="Wingdings" w:hAnsi="Wingdings" w:hint="default"/>
+        <w:sz w:val="20"/>
+      </w:rPr>
+    </w:lvl>
+    <w:lvl w:ilvl="3" w:tentative="1">
+      <w:start w:val="1"/>
+      <w:numFmt w:val="bullet"/>
+      <w:lvlText w:val=""/>
+      <w:lvlJc w:val="left"/>
+      <w:pPr>
+        <w:tabs>
+          <w:tab w:val="num" w:pos="2880"/>
+        </w:tabs>
+        <w:ind w:left="2880" w:hanging="360"/>
+      </w:pPr>
+      <w:rPr>
+        <w:rFonts w:ascii="Wingdings" w:hAnsi="Wingdings" w:hint="default"/>
+        <w:sz w:val="20"/>
+      </w:rPr>
+    </w:lvl>
+    <w:lvl w:ilvl="4" w:tentative="1">
+      <w:start w:val="1"/>
+      <w:numFmt w:val="bullet"/>
+      <w:lvlText w:val=""/>
+      <w:lvlJc w:val="left"/>
+      <w:pPr>
+        <w:tabs>
+          <w:tab w:val="num" w:pos="3600"/>
+        </w:tabs>
+        <w:ind w:left="3600" w:hanging="360"/>
+      </w:pPr>
+      <w:rPr>
+        <w:rFonts w:ascii="Wingdings" w:hAnsi="Wingdings" w:hint="default"/>
+        <w:sz w:val="20"/>
+      </w:rPr>
+    </w:lvl>
+    <w:lvl w:ilvl="5" w:tentative="1">
+      <w:start w:val="1"/>
+      <w:numFmt w:val="bullet"/>
+      <w:lvlText w:val=""/>
+      <w:lvlJc w:val="left"/>
+      <w:pPr>
+        <w:tabs>
+          <w:tab w:val="num" w:pos="4320"/>
+        </w:tabs>
+        <w:ind w:left="4320" w:hanging="360"/>
+      </w:pPr>
+      <w:rPr>
+        <w:rFonts w:ascii="Wingdings" w:hAnsi="Wingdings" w:hint="default"/>
+        <w:sz w:val="20"/>
+      </w:rPr>
+    </w:lvl>
+    <w:lvl w:ilvl="6" w:tentative="1">
+      <w:start w:val="1"/>
+      <w:numFmt w:val="bullet"/>
+      <w:lvlText w:val=""/>
+      <w:lvlJc w:val="left"/>
+      <w:pPr>
+        <w:tabs>
+          <w:tab w:val="num" w:pos="5040"/>
+        </w:tabs>
+        <w:ind w:left="5040" w:hanging="360"/>
+      </w:pPr>
+      <w:rPr>
+        <w:rFonts w:ascii="Wingdings" w:hAnsi="Wingdings" w:hint="default"/>
+        <w:sz w:val="20"/>
+      </w:rPr>
+    </w:lvl>
+    <w:lvl w:ilvl="7" w:tentative="1">
+      <w:start w:val="1"/>
+      <w:numFmt w:val="bullet"/>
+      <w:lvlText w:val=""/>
+      <w:lvlJc w:val="left"/>
+      <w:pPr>
+        <w:tabs>
+          <w:tab w:val="num" w:pos="5760"/>
+        </w:tabs>
+        <w:ind w:left="5760" w:hanging="360"/>
+      </w:pPr>
+      <w:rPr>
+        <w:rFonts w:ascii="Wingdings" w:hAnsi="Wingdings" w:hint="default"/>
+        <w:sz w:val="20"/>
+      </w:rPr>
+    </w:lvl>
+    <w:lvl w:ilvl="8" w:tentative="1">
+      <w:start w:val="1"/>
+      <w:numFmt w:val="bullet"/>
+      <w:lvlText w:val=""/>
+      <w:lvlJc w:val="left"/>
+      <w:pPr>
+        <w:tabs>
+          <w:tab w:val="num" w:pos="6480"/>
+        </w:tabs>
+        <w:ind w:left="6480" w:hanging="360"/>
+      </w:pPr>
+      <w:rPr>
+        <w:rFonts w:ascii="Wingdings" w:hAnsi="Wingdings" w:hint="default"/>
+        <w:sz w:val="20"/>
+      </w:rPr>
+    </w:lvl>
+  </w:abstractNum>
+  <w:abstractNum w:abstractNumId="7" w15:restartNumberingAfterBreak="0">
     <w:nsid w:val="1FEB3FDF"/>
     <w:multiLevelType w:val="multilevel"/>
     <w:tmpl w:val="FCB0796E"/>
@@ -2191,7 +3581,7 @@
       </w:rPr>
     </w:lvl>
   </w:abstractNum>
-  <w:abstractNum w:abstractNumId="5" w15:restartNumberingAfterBreak="0">
+  <w:abstractNum w:abstractNumId="8" w15:restartNumberingAfterBreak="0">
     <w:nsid w:val="21656152"/>
     <w:multiLevelType w:val="multilevel"/>
     <w:tmpl w:val="C61EE608"/>
@@ -2340,7 +3730,7 @@
       </w:rPr>
     </w:lvl>
   </w:abstractNum>
-  <w:abstractNum w:abstractNumId="6" w15:restartNumberingAfterBreak="0">
+  <w:abstractNum w:abstractNumId="9" w15:restartNumberingAfterBreak="0">
     <w:nsid w:val="23342CF2"/>
     <w:multiLevelType w:val="multilevel"/>
     <w:tmpl w:val="E48E9C60"/>
@@ -2489,7 +3879,7 @@
       </w:rPr>
     </w:lvl>
   </w:abstractNum>
-  <w:abstractNum w:abstractNumId="7" w15:restartNumberingAfterBreak="0">
+  <w:abstractNum w:abstractNumId="10" w15:restartNumberingAfterBreak="0">
     <w:nsid w:val="27EC352B"/>
     <w:multiLevelType w:val="multilevel"/>
     <w:tmpl w:val="F96E95B2"/>
@@ -2638,7 +4028,7 @@
       </w:rPr>
     </w:lvl>
   </w:abstractNum>
-  <w:abstractNum w:abstractNumId="8" w15:restartNumberingAfterBreak="0">
+  <w:abstractNum w:abstractNumId="11" w15:restartNumberingAfterBreak="0">
     <w:nsid w:val="28C24230"/>
     <w:multiLevelType w:val="multilevel"/>
     <w:tmpl w:val="D5EE8FE0"/>
@@ -2787,7 +4177,7 @@
       </w:rPr>
     </w:lvl>
   </w:abstractNum>
-  <w:abstractNum w:abstractNumId="9" w15:restartNumberingAfterBreak="0">
+  <w:abstractNum w:abstractNumId="12" w15:restartNumberingAfterBreak="0">
     <w:nsid w:val="2A4377A6"/>
     <w:multiLevelType w:val="multilevel"/>
     <w:tmpl w:val="CDC23B56"/>
@@ -2936,7 +4326,7 @@
       </w:rPr>
     </w:lvl>
   </w:abstractNum>
-  <w:abstractNum w:abstractNumId="10" w15:restartNumberingAfterBreak="0">
+  <w:abstractNum w:abstractNumId="13" w15:restartNumberingAfterBreak="0">
     <w:nsid w:val="2B337F58"/>
     <w:multiLevelType w:val="multilevel"/>
     <w:tmpl w:val="345CF4F4"/>
@@ -3085,7 +4475,7 @@
       </w:rPr>
     </w:lvl>
   </w:abstractNum>
-  <w:abstractNum w:abstractNumId="11" w15:restartNumberingAfterBreak="0">
+  <w:abstractNum w:abstractNumId="14" w15:restartNumberingAfterBreak="0">
     <w:nsid w:val="2D8A5434"/>
     <w:multiLevelType w:val="multilevel"/>
     <w:tmpl w:val="14CE94F4"/>
@@ -3234,7 +4624,7 @@
       </w:rPr>
     </w:lvl>
   </w:abstractNum>
-  <w:abstractNum w:abstractNumId="12" w15:restartNumberingAfterBreak="0">
+  <w:abstractNum w:abstractNumId="15" w15:restartNumberingAfterBreak="0">
     <w:nsid w:val="327327D7"/>
     <w:multiLevelType w:val="multilevel"/>
     <w:tmpl w:val="514E9B36"/>
@@ -3383,7 +4773,7 @@
       </w:rPr>
     </w:lvl>
   </w:abstractNum>
-  <w:abstractNum w:abstractNumId="13" w15:restartNumberingAfterBreak="0">
+  <w:abstractNum w:abstractNumId="16" w15:restartNumberingAfterBreak="0">
     <w:nsid w:val="33FD3588"/>
     <w:multiLevelType w:val="multilevel"/>
     <w:tmpl w:val="A8E4CB9C"/>
@@ -3532,7 +4922,893 @@
       </w:rPr>
     </w:lvl>
   </w:abstractNum>
-  <w:abstractNum w:abstractNumId="14" w15:restartNumberingAfterBreak="0">
+  <w:abstractNum w:abstractNumId="17" w15:restartNumberingAfterBreak="0">
+    <w:nsid w:val="35E70F41"/>
+    <w:multiLevelType w:val="multilevel"/>
+    <w:tmpl w:val="C0F05EB2"/>
+    <w:lvl w:ilvl="0">
+      <w:start w:val="1"/>
+      <w:numFmt w:val="bullet"/>
+      <w:lvlText w:val=""/>
+      <w:lvlJc w:val="left"/>
+      <w:pPr>
+        <w:tabs>
+          <w:tab w:val="num" w:pos="720"/>
+        </w:tabs>
+        <w:ind w:left="720" w:hanging="360"/>
+      </w:pPr>
+      <w:rPr>
+        <w:rFonts w:ascii="Symbol" w:hAnsi="Symbol" w:hint="default"/>
+        <w:sz w:val="20"/>
+      </w:rPr>
+    </w:lvl>
+    <w:lvl w:ilvl="1" w:tentative="1">
+      <w:start w:val="1"/>
+      <w:numFmt w:val="bullet"/>
+      <w:lvlText w:val="o"/>
+      <w:lvlJc w:val="left"/>
+      <w:pPr>
+        <w:tabs>
+          <w:tab w:val="num" w:pos="1440"/>
+        </w:tabs>
+        <w:ind w:left="1440" w:hanging="360"/>
+      </w:pPr>
+      <w:rPr>
+        <w:rFonts w:ascii="Courier New" w:hAnsi="Courier New" w:hint="default"/>
+        <w:sz w:val="20"/>
+      </w:rPr>
+    </w:lvl>
+    <w:lvl w:ilvl="2" w:tentative="1">
+      <w:start w:val="1"/>
+      <w:numFmt w:val="bullet"/>
+      <w:lvlText w:val=""/>
+      <w:lvlJc w:val="left"/>
+      <w:pPr>
+        <w:tabs>
+          <w:tab w:val="num" w:pos="2160"/>
+        </w:tabs>
+        <w:ind w:left="2160" w:hanging="360"/>
+      </w:pPr>
+      <w:rPr>
+        <w:rFonts w:ascii="Wingdings" w:hAnsi="Wingdings" w:hint="default"/>
+        <w:sz w:val="20"/>
+      </w:rPr>
+    </w:lvl>
+    <w:lvl w:ilvl="3" w:tentative="1">
+      <w:start w:val="1"/>
+      <w:numFmt w:val="bullet"/>
+      <w:lvlText w:val=""/>
+      <w:lvlJc w:val="left"/>
+      <w:pPr>
+        <w:tabs>
+          <w:tab w:val="num" w:pos="2880"/>
+        </w:tabs>
+        <w:ind w:left="2880" w:hanging="360"/>
+      </w:pPr>
+      <w:rPr>
+        <w:rFonts w:ascii="Wingdings" w:hAnsi="Wingdings" w:hint="default"/>
+        <w:sz w:val="20"/>
+      </w:rPr>
+    </w:lvl>
+    <w:lvl w:ilvl="4" w:tentative="1">
+      <w:start w:val="1"/>
+      <w:numFmt w:val="bullet"/>
+      <w:lvlText w:val=""/>
+      <w:lvlJc w:val="left"/>
+      <w:pPr>
+        <w:tabs>
+          <w:tab w:val="num" w:pos="3600"/>
+        </w:tabs>
+        <w:ind w:left="3600" w:hanging="360"/>
+      </w:pPr>
+      <w:rPr>
+        <w:rFonts w:ascii="Wingdings" w:hAnsi="Wingdings" w:hint="default"/>
+        <w:sz w:val="20"/>
+      </w:rPr>
+    </w:lvl>
+    <w:lvl w:ilvl="5" w:tentative="1">
+      <w:start w:val="1"/>
+      <w:numFmt w:val="bullet"/>
+      <w:lvlText w:val=""/>
+      <w:lvlJc w:val="left"/>
+      <w:pPr>
+        <w:tabs>
+          <w:tab w:val="num" w:pos="4320"/>
+        </w:tabs>
+        <w:ind w:left="4320" w:hanging="360"/>
+      </w:pPr>
+      <w:rPr>
+        <w:rFonts w:ascii="Wingdings" w:hAnsi="Wingdings" w:hint="default"/>
+        <w:sz w:val="20"/>
+      </w:rPr>
+    </w:lvl>
+    <w:lvl w:ilvl="6" w:tentative="1">
+      <w:start w:val="1"/>
+      <w:numFmt w:val="bullet"/>
+      <w:lvlText w:val=""/>
+      <w:lvlJc w:val="left"/>
+      <w:pPr>
+        <w:tabs>
+          <w:tab w:val="num" w:pos="5040"/>
+        </w:tabs>
+        <w:ind w:left="5040" w:hanging="360"/>
+      </w:pPr>
+      <w:rPr>
+        <w:rFonts w:ascii="Wingdings" w:hAnsi="Wingdings" w:hint="default"/>
+        <w:sz w:val="20"/>
+      </w:rPr>
+    </w:lvl>
+    <w:lvl w:ilvl="7" w:tentative="1">
+      <w:start w:val="1"/>
+      <w:numFmt w:val="bullet"/>
+      <w:lvlText w:val=""/>
+      <w:lvlJc w:val="left"/>
+      <w:pPr>
+        <w:tabs>
+          <w:tab w:val="num" w:pos="5760"/>
+        </w:tabs>
+        <w:ind w:left="5760" w:hanging="360"/>
+      </w:pPr>
+      <w:rPr>
+        <w:rFonts w:ascii="Wingdings" w:hAnsi="Wingdings" w:hint="default"/>
+        <w:sz w:val="20"/>
+      </w:rPr>
+    </w:lvl>
+    <w:lvl w:ilvl="8" w:tentative="1">
+      <w:start w:val="1"/>
+      <w:numFmt w:val="bullet"/>
+      <w:lvlText w:val=""/>
+      <w:lvlJc w:val="left"/>
+      <w:pPr>
+        <w:tabs>
+          <w:tab w:val="num" w:pos="6480"/>
+        </w:tabs>
+        <w:ind w:left="6480" w:hanging="360"/>
+      </w:pPr>
+      <w:rPr>
+        <w:rFonts w:ascii="Wingdings" w:hAnsi="Wingdings" w:hint="default"/>
+        <w:sz w:val="20"/>
+      </w:rPr>
+    </w:lvl>
+  </w:abstractNum>
+  <w:abstractNum w:abstractNumId="18" w15:restartNumberingAfterBreak="0">
+    <w:nsid w:val="360E67B5"/>
+    <w:multiLevelType w:val="multilevel"/>
+    <w:tmpl w:val="BD50313A"/>
+    <w:lvl w:ilvl="0">
+      <w:start w:val="1"/>
+      <w:numFmt w:val="bullet"/>
+      <w:lvlText w:val=""/>
+      <w:lvlJc w:val="left"/>
+      <w:pPr>
+        <w:tabs>
+          <w:tab w:val="num" w:pos="720"/>
+        </w:tabs>
+        <w:ind w:left="720" w:hanging="360"/>
+      </w:pPr>
+      <w:rPr>
+        <w:rFonts w:ascii="Symbol" w:hAnsi="Symbol" w:hint="default"/>
+        <w:sz w:val="20"/>
+      </w:rPr>
+    </w:lvl>
+    <w:lvl w:ilvl="1">
+      <w:start w:val="1"/>
+      <w:numFmt w:val="decimal"/>
+      <w:lvlText w:val="%2."/>
+      <w:lvlJc w:val="left"/>
+      <w:pPr>
+        <w:tabs>
+          <w:tab w:val="num" w:pos="1440"/>
+        </w:tabs>
+        <w:ind w:left="1440" w:hanging="360"/>
+      </w:pPr>
+    </w:lvl>
+    <w:lvl w:ilvl="2" w:tentative="1">
+      <w:start w:val="1"/>
+      <w:numFmt w:val="bullet"/>
+      <w:lvlText w:val=""/>
+      <w:lvlJc w:val="left"/>
+      <w:pPr>
+        <w:tabs>
+          <w:tab w:val="num" w:pos="2160"/>
+        </w:tabs>
+        <w:ind w:left="2160" w:hanging="360"/>
+      </w:pPr>
+      <w:rPr>
+        <w:rFonts w:ascii="Wingdings" w:hAnsi="Wingdings" w:hint="default"/>
+        <w:sz w:val="20"/>
+      </w:rPr>
+    </w:lvl>
+    <w:lvl w:ilvl="3" w:tentative="1">
+      <w:start w:val="1"/>
+      <w:numFmt w:val="bullet"/>
+      <w:lvlText w:val=""/>
+      <w:lvlJc w:val="left"/>
+      <w:pPr>
+        <w:tabs>
+          <w:tab w:val="num" w:pos="2880"/>
+        </w:tabs>
+        <w:ind w:left="2880" w:hanging="360"/>
+      </w:pPr>
+      <w:rPr>
+        <w:rFonts w:ascii="Wingdings" w:hAnsi="Wingdings" w:hint="default"/>
+        <w:sz w:val="20"/>
+      </w:rPr>
+    </w:lvl>
+    <w:lvl w:ilvl="4" w:tentative="1">
+      <w:start w:val="1"/>
+      <w:numFmt w:val="bullet"/>
+      <w:lvlText w:val=""/>
+      <w:lvlJc w:val="left"/>
+      <w:pPr>
+        <w:tabs>
+          <w:tab w:val="num" w:pos="3600"/>
+        </w:tabs>
+        <w:ind w:left="3600" w:hanging="360"/>
+      </w:pPr>
+      <w:rPr>
+        <w:rFonts w:ascii="Wingdings" w:hAnsi="Wingdings" w:hint="default"/>
+        <w:sz w:val="20"/>
+      </w:rPr>
+    </w:lvl>
+    <w:lvl w:ilvl="5" w:tentative="1">
+      <w:start w:val="1"/>
+      <w:numFmt w:val="bullet"/>
+      <w:lvlText w:val=""/>
+      <w:lvlJc w:val="left"/>
+      <w:pPr>
+        <w:tabs>
+          <w:tab w:val="num" w:pos="4320"/>
+        </w:tabs>
+        <w:ind w:left="4320" w:hanging="360"/>
+      </w:pPr>
+      <w:rPr>
+        <w:rFonts w:ascii="Wingdings" w:hAnsi="Wingdings" w:hint="default"/>
+        <w:sz w:val="20"/>
+      </w:rPr>
+    </w:lvl>
+    <w:lvl w:ilvl="6" w:tentative="1">
+      <w:start w:val="1"/>
+      <w:numFmt w:val="bullet"/>
+      <w:lvlText w:val=""/>
+      <w:lvlJc w:val="left"/>
+      <w:pPr>
+        <w:tabs>
+          <w:tab w:val="num" w:pos="5040"/>
+        </w:tabs>
+        <w:ind w:left="5040" w:hanging="360"/>
+      </w:pPr>
+      <w:rPr>
+        <w:rFonts w:ascii="Wingdings" w:hAnsi="Wingdings" w:hint="default"/>
+        <w:sz w:val="20"/>
+      </w:rPr>
+    </w:lvl>
+    <w:lvl w:ilvl="7" w:tentative="1">
+      <w:start w:val="1"/>
+      <w:numFmt w:val="bullet"/>
+      <w:lvlText w:val=""/>
+      <w:lvlJc w:val="left"/>
+      <w:pPr>
+        <w:tabs>
+          <w:tab w:val="num" w:pos="5760"/>
+        </w:tabs>
+        <w:ind w:left="5760" w:hanging="360"/>
+      </w:pPr>
+      <w:rPr>
+        <w:rFonts w:ascii="Wingdings" w:hAnsi="Wingdings" w:hint="default"/>
+        <w:sz w:val="20"/>
+      </w:rPr>
+    </w:lvl>
+    <w:lvl w:ilvl="8" w:tentative="1">
+      <w:start w:val="1"/>
+      <w:numFmt w:val="bullet"/>
+      <w:lvlText w:val=""/>
+      <w:lvlJc w:val="left"/>
+      <w:pPr>
+        <w:tabs>
+          <w:tab w:val="num" w:pos="6480"/>
+        </w:tabs>
+        <w:ind w:left="6480" w:hanging="360"/>
+      </w:pPr>
+      <w:rPr>
+        <w:rFonts w:ascii="Wingdings" w:hAnsi="Wingdings" w:hint="default"/>
+        <w:sz w:val="20"/>
+      </w:rPr>
+    </w:lvl>
+  </w:abstractNum>
+  <w:abstractNum w:abstractNumId="19" w15:restartNumberingAfterBreak="0">
+    <w:nsid w:val="364710FB"/>
+    <w:multiLevelType w:val="multilevel"/>
+    <w:tmpl w:val="1C9614A8"/>
+    <w:lvl w:ilvl="0">
+      <w:start w:val="1"/>
+      <w:numFmt w:val="bullet"/>
+      <w:lvlText w:val=""/>
+      <w:lvlJc w:val="left"/>
+      <w:pPr>
+        <w:tabs>
+          <w:tab w:val="num" w:pos="720"/>
+        </w:tabs>
+        <w:ind w:left="720" w:hanging="360"/>
+      </w:pPr>
+      <w:rPr>
+        <w:rFonts w:ascii="Symbol" w:hAnsi="Symbol" w:hint="default"/>
+        <w:sz w:val="20"/>
+      </w:rPr>
+    </w:lvl>
+    <w:lvl w:ilvl="1" w:tentative="1">
+      <w:start w:val="1"/>
+      <w:numFmt w:val="bullet"/>
+      <w:lvlText w:val="o"/>
+      <w:lvlJc w:val="left"/>
+      <w:pPr>
+        <w:tabs>
+          <w:tab w:val="num" w:pos="1440"/>
+        </w:tabs>
+        <w:ind w:left="1440" w:hanging="360"/>
+      </w:pPr>
+      <w:rPr>
+        <w:rFonts w:ascii="Courier New" w:hAnsi="Courier New" w:hint="default"/>
+        <w:sz w:val="20"/>
+      </w:rPr>
+    </w:lvl>
+    <w:lvl w:ilvl="2" w:tentative="1">
+      <w:start w:val="1"/>
+      <w:numFmt w:val="bullet"/>
+      <w:lvlText w:val=""/>
+      <w:lvlJc w:val="left"/>
+      <w:pPr>
+        <w:tabs>
+          <w:tab w:val="num" w:pos="2160"/>
+        </w:tabs>
+        <w:ind w:left="2160" w:hanging="360"/>
+      </w:pPr>
+      <w:rPr>
+        <w:rFonts w:ascii="Wingdings" w:hAnsi="Wingdings" w:hint="default"/>
+        <w:sz w:val="20"/>
+      </w:rPr>
+    </w:lvl>
+    <w:lvl w:ilvl="3" w:tentative="1">
+      <w:start w:val="1"/>
+      <w:numFmt w:val="bullet"/>
+      <w:lvlText w:val=""/>
+      <w:lvlJc w:val="left"/>
+      <w:pPr>
+        <w:tabs>
+          <w:tab w:val="num" w:pos="2880"/>
+        </w:tabs>
+        <w:ind w:left="2880" w:hanging="360"/>
+      </w:pPr>
+      <w:rPr>
+        <w:rFonts w:ascii="Wingdings" w:hAnsi="Wingdings" w:hint="default"/>
+        <w:sz w:val="20"/>
+      </w:rPr>
+    </w:lvl>
+    <w:lvl w:ilvl="4" w:tentative="1">
+      <w:start w:val="1"/>
+      <w:numFmt w:val="bullet"/>
+      <w:lvlText w:val=""/>
+      <w:lvlJc w:val="left"/>
+      <w:pPr>
+        <w:tabs>
+          <w:tab w:val="num" w:pos="3600"/>
+        </w:tabs>
+        <w:ind w:left="3600" w:hanging="360"/>
+      </w:pPr>
+      <w:rPr>
+        <w:rFonts w:ascii="Wingdings" w:hAnsi="Wingdings" w:hint="default"/>
+        <w:sz w:val="20"/>
+      </w:rPr>
+    </w:lvl>
+    <w:lvl w:ilvl="5" w:tentative="1">
+      <w:start w:val="1"/>
+      <w:numFmt w:val="bullet"/>
+      <w:lvlText w:val=""/>
+      <w:lvlJc w:val="left"/>
+      <w:pPr>
+        <w:tabs>
+          <w:tab w:val="num" w:pos="4320"/>
+        </w:tabs>
+        <w:ind w:left="4320" w:hanging="360"/>
+      </w:pPr>
+      <w:rPr>
+        <w:rFonts w:ascii="Wingdings" w:hAnsi="Wingdings" w:hint="default"/>
+        <w:sz w:val="20"/>
+      </w:rPr>
+    </w:lvl>
+    <w:lvl w:ilvl="6" w:tentative="1">
+      <w:start w:val="1"/>
+      <w:numFmt w:val="bullet"/>
+      <w:lvlText w:val=""/>
+      <w:lvlJc w:val="left"/>
+      <w:pPr>
+        <w:tabs>
+          <w:tab w:val="num" w:pos="5040"/>
+        </w:tabs>
+        <w:ind w:left="5040" w:hanging="360"/>
+      </w:pPr>
+      <w:rPr>
+        <w:rFonts w:ascii="Wingdings" w:hAnsi="Wingdings" w:hint="default"/>
+        <w:sz w:val="20"/>
+      </w:rPr>
+    </w:lvl>
+    <w:lvl w:ilvl="7" w:tentative="1">
+      <w:start w:val="1"/>
+      <w:numFmt w:val="bullet"/>
+      <w:lvlText w:val=""/>
+      <w:lvlJc w:val="left"/>
+      <w:pPr>
+        <w:tabs>
+          <w:tab w:val="num" w:pos="5760"/>
+        </w:tabs>
+        <w:ind w:left="5760" w:hanging="360"/>
+      </w:pPr>
+      <w:rPr>
+        <w:rFonts w:ascii="Wingdings" w:hAnsi="Wingdings" w:hint="default"/>
+        <w:sz w:val="20"/>
+      </w:rPr>
+    </w:lvl>
+    <w:lvl w:ilvl="8" w:tentative="1">
+      <w:start w:val="1"/>
+      <w:numFmt w:val="bullet"/>
+      <w:lvlText w:val=""/>
+      <w:lvlJc w:val="left"/>
+      <w:pPr>
+        <w:tabs>
+          <w:tab w:val="num" w:pos="6480"/>
+        </w:tabs>
+        <w:ind w:left="6480" w:hanging="360"/>
+      </w:pPr>
+      <w:rPr>
+        <w:rFonts w:ascii="Wingdings" w:hAnsi="Wingdings" w:hint="default"/>
+        <w:sz w:val="20"/>
+      </w:rPr>
+    </w:lvl>
+  </w:abstractNum>
+  <w:abstractNum w:abstractNumId="20" w15:restartNumberingAfterBreak="0">
+    <w:nsid w:val="3824057D"/>
+    <w:multiLevelType w:val="multilevel"/>
+    <w:tmpl w:val="7E6C67AE"/>
+    <w:lvl w:ilvl="0">
+      <w:start w:val="1"/>
+      <w:numFmt w:val="bullet"/>
+      <w:lvlText w:val=""/>
+      <w:lvlJc w:val="left"/>
+      <w:pPr>
+        <w:tabs>
+          <w:tab w:val="num" w:pos="720"/>
+        </w:tabs>
+        <w:ind w:left="720" w:hanging="360"/>
+      </w:pPr>
+      <w:rPr>
+        <w:rFonts w:ascii="Symbol" w:hAnsi="Symbol" w:hint="default"/>
+        <w:sz w:val="20"/>
+      </w:rPr>
+    </w:lvl>
+    <w:lvl w:ilvl="1">
+      <w:start w:val="1"/>
+      <w:numFmt w:val="bullet"/>
+      <w:lvlText w:val="o"/>
+      <w:lvlJc w:val="left"/>
+      <w:pPr>
+        <w:tabs>
+          <w:tab w:val="num" w:pos="1440"/>
+        </w:tabs>
+        <w:ind w:left="1440" w:hanging="360"/>
+      </w:pPr>
+      <w:rPr>
+        <w:rFonts w:ascii="Courier New" w:hAnsi="Courier New" w:hint="default"/>
+        <w:sz w:val="20"/>
+      </w:rPr>
+    </w:lvl>
+    <w:lvl w:ilvl="2" w:tentative="1">
+      <w:start w:val="1"/>
+      <w:numFmt w:val="bullet"/>
+      <w:lvlText w:val=""/>
+      <w:lvlJc w:val="left"/>
+      <w:pPr>
+        <w:tabs>
+          <w:tab w:val="num" w:pos="2160"/>
+        </w:tabs>
+        <w:ind w:left="2160" w:hanging="360"/>
+      </w:pPr>
+      <w:rPr>
+        <w:rFonts w:ascii="Wingdings" w:hAnsi="Wingdings" w:hint="default"/>
+        <w:sz w:val="20"/>
+      </w:rPr>
+    </w:lvl>
+    <w:lvl w:ilvl="3" w:tentative="1">
+      <w:start w:val="1"/>
+      <w:numFmt w:val="bullet"/>
+      <w:lvlText w:val=""/>
+      <w:lvlJc w:val="left"/>
+      <w:pPr>
+        <w:tabs>
+          <w:tab w:val="num" w:pos="2880"/>
+        </w:tabs>
+        <w:ind w:left="2880" w:hanging="360"/>
+      </w:pPr>
+      <w:rPr>
+        <w:rFonts w:ascii="Wingdings" w:hAnsi="Wingdings" w:hint="default"/>
+        <w:sz w:val="20"/>
+      </w:rPr>
+    </w:lvl>
+    <w:lvl w:ilvl="4" w:tentative="1">
+      <w:start w:val="1"/>
+      <w:numFmt w:val="bullet"/>
+      <w:lvlText w:val=""/>
+      <w:lvlJc w:val="left"/>
+      <w:pPr>
+        <w:tabs>
+          <w:tab w:val="num" w:pos="3600"/>
+        </w:tabs>
+        <w:ind w:left="3600" w:hanging="360"/>
+      </w:pPr>
+      <w:rPr>
+        <w:rFonts w:ascii="Wingdings" w:hAnsi="Wingdings" w:hint="default"/>
+        <w:sz w:val="20"/>
+      </w:rPr>
+    </w:lvl>
+    <w:lvl w:ilvl="5" w:tentative="1">
+      <w:start w:val="1"/>
+      <w:numFmt w:val="bullet"/>
+      <w:lvlText w:val=""/>
+      <w:lvlJc w:val="left"/>
+      <w:pPr>
+        <w:tabs>
+          <w:tab w:val="num" w:pos="4320"/>
+        </w:tabs>
+        <w:ind w:left="4320" w:hanging="360"/>
+      </w:pPr>
+      <w:rPr>
+        <w:rFonts w:ascii="Wingdings" w:hAnsi="Wingdings" w:hint="default"/>
+        <w:sz w:val="20"/>
+      </w:rPr>
+    </w:lvl>
+    <w:lvl w:ilvl="6" w:tentative="1">
+      <w:start w:val="1"/>
+      <w:numFmt w:val="bullet"/>
+      <w:lvlText w:val=""/>
+      <w:lvlJc w:val="left"/>
+      <w:pPr>
+        <w:tabs>
+          <w:tab w:val="num" w:pos="5040"/>
+        </w:tabs>
+        <w:ind w:left="5040" w:hanging="360"/>
+      </w:pPr>
+      <w:rPr>
+        <w:rFonts w:ascii="Wingdings" w:hAnsi="Wingdings" w:hint="default"/>
+        <w:sz w:val="20"/>
+      </w:rPr>
+    </w:lvl>
+    <w:lvl w:ilvl="7" w:tentative="1">
+      <w:start w:val="1"/>
+      <w:numFmt w:val="bullet"/>
+      <w:lvlText w:val=""/>
+      <w:lvlJc w:val="left"/>
+      <w:pPr>
+        <w:tabs>
+          <w:tab w:val="num" w:pos="5760"/>
+        </w:tabs>
+        <w:ind w:left="5760" w:hanging="360"/>
+      </w:pPr>
+      <w:rPr>
+        <w:rFonts w:ascii="Wingdings" w:hAnsi="Wingdings" w:hint="default"/>
+        <w:sz w:val="20"/>
+      </w:rPr>
+    </w:lvl>
+    <w:lvl w:ilvl="8" w:tentative="1">
+      <w:start w:val="1"/>
+      <w:numFmt w:val="bullet"/>
+      <w:lvlText w:val=""/>
+      <w:lvlJc w:val="left"/>
+      <w:pPr>
+        <w:tabs>
+          <w:tab w:val="num" w:pos="6480"/>
+        </w:tabs>
+        <w:ind w:left="6480" w:hanging="360"/>
+      </w:pPr>
+      <w:rPr>
+        <w:rFonts w:ascii="Wingdings" w:hAnsi="Wingdings" w:hint="default"/>
+        <w:sz w:val="20"/>
+      </w:rPr>
+    </w:lvl>
+  </w:abstractNum>
+  <w:abstractNum w:abstractNumId="21" w15:restartNumberingAfterBreak="0">
+    <w:nsid w:val="38E13D49"/>
+    <w:multiLevelType w:val="multilevel"/>
+    <w:tmpl w:val="D63A0A84"/>
+    <w:lvl w:ilvl="0">
+      <w:start w:val="1"/>
+      <w:numFmt w:val="bullet"/>
+      <w:lvlText w:val=""/>
+      <w:lvlJc w:val="left"/>
+      <w:pPr>
+        <w:tabs>
+          <w:tab w:val="num" w:pos="720"/>
+        </w:tabs>
+        <w:ind w:left="720" w:hanging="360"/>
+      </w:pPr>
+      <w:rPr>
+        <w:rFonts w:ascii="Symbol" w:hAnsi="Symbol" w:hint="default"/>
+        <w:sz w:val="20"/>
+      </w:rPr>
+    </w:lvl>
+    <w:lvl w:ilvl="1">
+      <w:start w:val="1"/>
+      <w:numFmt w:val="decimal"/>
+      <w:lvlText w:val="%2."/>
+      <w:lvlJc w:val="left"/>
+      <w:pPr>
+        <w:tabs>
+          <w:tab w:val="num" w:pos="1440"/>
+        </w:tabs>
+        <w:ind w:left="1440" w:hanging="360"/>
+      </w:pPr>
+    </w:lvl>
+    <w:lvl w:ilvl="2" w:tentative="1">
+      <w:start w:val="1"/>
+      <w:numFmt w:val="bullet"/>
+      <w:lvlText w:val=""/>
+      <w:lvlJc w:val="left"/>
+      <w:pPr>
+        <w:tabs>
+          <w:tab w:val="num" w:pos="2160"/>
+        </w:tabs>
+        <w:ind w:left="2160" w:hanging="360"/>
+      </w:pPr>
+      <w:rPr>
+        <w:rFonts w:ascii="Wingdings" w:hAnsi="Wingdings" w:hint="default"/>
+        <w:sz w:val="20"/>
+      </w:rPr>
+    </w:lvl>
+    <w:lvl w:ilvl="3" w:tentative="1">
+      <w:start w:val="1"/>
+      <w:numFmt w:val="bullet"/>
+      <w:lvlText w:val=""/>
+      <w:lvlJc w:val="left"/>
+      <w:pPr>
+        <w:tabs>
+          <w:tab w:val="num" w:pos="2880"/>
+        </w:tabs>
+        <w:ind w:left="2880" w:hanging="360"/>
+      </w:pPr>
+      <w:rPr>
+        <w:rFonts w:ascii="Wingdings" w:hAnsi="Wingdings" w:hint="default"/>
+        <w:sz w:val="20"/>
+      </w:rPr>
+    </w:lvl>
+    <w:lvl w:ilvl="4" w:tentative="1">
+      <w:start w:val="1"/>
+      <w:numFmt w:val="bullet"/>
+      <w:lvlText w:val=""/>
+      <w:lvlJc w:val="left"/>
+      <w:pPr>
+        <w:tabs>
+          <w:tab w:val="num" w:pos="3600"/>
+        </w:tabs>
+        <w:ind w:left="3600" w:hanging="360"/>
+      </w:pPr>
+      <w:rPr>
+        <w:rFonts w:ascii="Wingdings" w:hAnsi="Wingdings" w:hint="default"/>
+        <w:sz w:val="20"/>
+      </w:rPr>
+    </w:lvl>
+    <w:lvl w:ilvl="5" w:tentative="1">
+      <w:start w:val="1"/>
+      <w:numFmt w:val="bullet"/>
+      <w:lvlText w:val=""/>
+      <w:lvlJc w:val="left"/>
+      <w:pPr>
+        <w:tabs>
+          <w:tab w:val="num" w:pos="4320"/>
+        </w:tabs>
+        <w:ind w:left="4320" w:hanging="360"/>
+      </w:pPr>
+      <w:rPr>
+        <w:rFonts w:ascii="Wingdings" w:hAnsi="Wingdings" w:hint="default"/>
+        <w:sz w:val="20"/>
+      </w:rPr>
+    </w:lvl>
+    <w:lvl w:ilvl="6" w:tentative="1">
+      <w:start w:val="1"/>
+      <w:numFmt w:val="bullet"/>
+      <w:lvlText w:val=""/>
+      <w:lvlJc w:val="left"/>
+      <w:pPr>
+        <w:tabs>
+          <w:tab w:val="num" w:pos="5040"/>
+        </w:tabs>
+        <w:ind w:left="5040" w:hanging="360"/>
+      </w:pPr>
+      <w:rPr>
+        <w:rFonts w:ascii="Wingdings" w:hAnsi="Wingdings" w:hint="default"/>
+        <w:sz w:val="20"/>
+      </w:rPr>
+    </w:lvl>
+    <w:lvl w:ilvl="7" w:tentative="1">
+      <w:start w:val="1"/>
+      <w:numFmt w:val="bullet"/>
+      <w:lvlText w:val=""/>
+      <w:lvlJc w:val="left"/>
+      <w:pPr>
+        <w:tabs>
+          <w:tab w:val="num" w:pos="5760"/>
+        </w:tabs>
+        <w:ind w:left="5760" w:hanging="360"/>
+      </w:pPr>
+      <w:rPr>
+        <w:rFonts w:ascii="Wingdings" w:hAnsi="Wingdings" w:hint="default"/>
+        <w:sz w:val="20"/>
+      </w:rPr>
+    </w:lvl>
+    <w:lvl w:ilvl="8" w:tentative="1">
+      <w:start w:val="1"/>
+      <w:numFmt w:val="bullet"/>
+      <w:lvlText w:val=""/>
+      <w:lvlJc w:val="left"/>
+      <w:pPr>
+        <w:tabs>
+          <w:tab w:val="num" w:pos="6480"/>
+        </w:tabs>
+        <w:ind w:left="6480" w:hanging="360"/>
+      </w:pPr>
+      <w:rPr>
+        <w:rFonts w:ascii="Wingdings" w:hAnsi="Wingdings" w:hint="default"/>
+        <w:sz w:val="20"/>
+      </w:rPr>
+    </w:lvl>
+  </w:abstractNum>
+  <w:abstractNum w:abstractNumId="22" w15:restartNumberingAfterBreak="0">
+    <w:nsid w:val="43183C3E"/>
+    <w:multiLevelType w:val="multilevel"/>
+    <w:tmpl w:val="9E2A2EAC"/>
+    <w:lvl w:ilvl="0">
+      <w:start w:val="1"/>
+      <w:numFmt w:val="bullet"/>
+      <w:lvlText w:val=""/>
+      <w:lvlJc w:val="left"/>
+      <w:pPr>
+        <w:tabs>
+          <w:tab w:val="num" w:pos="720"/>
+        </w:tabs>
+        <w:ind w:left="720" w:hanging="360"/>
+      </w:pPr>
+      <w:rPr>
+        <w:rFonts w:ascii="Symbol" w:hAnsi="Symbol" w:hint="default"/>
+        <w:sz w:val="20"/>
+      </w:rPr>
+    </w:lvl>
+    <w:lvl w:ilvl="1" w:tentative="1">
+      <w:start w:val="1"/>
+      <w:numFmt w:val="bullet"/>
+      <w:lvlText w:val="o"/>
+      <w:lvlJc w:val="left"/>
+      <w:pPr>
+        <w:tabs>
+          <w:tab w:val="num" w:pos="1440"/>
+        </w:tabs>
+        <w:ind w:left="1440" w:hanging="360"/>
+      </w:pPr>
+      <w:rPr>
+        <w:rFonts w:ascii="Courier New" w:hAnsi="Courier New" w:hint="default"/>
+        <w:sz w:val="20"/>
+      </w:rPr>
+    </w:lvl>
+    <w:lvl w:ilvl="2" w:tentative="1">
+      <w:start w:val="1"/>
+      <w:numFmt w:val="bullet"/>
+      <w:lvlText w:val=""/>
+      <w:lvlJc w:val="left"/>
+      <w:pPr>
+        <w:tabs>
+          <w:tab w:val="num" w:pos="2160"/>
+        </w:tabs>
+        <w:ind w:left="2160" w:hanging="360"/>
+      </w:pPr>
+      <w:rPr>
+        <w:rFonts w:ascii="Wingdings" w:hAnsi="Wingdings" w:hint="default"/>
+        <w:sz w:val="20"/>
+      </w:rPr>
+    </w:lvl>
+    <w:lvl w:ilvl="3" w:tentative="1">
+      <w:start w:val="1"/>
+      <w:numFmt w:val="bullet"/>
+      <w:lvlText w:val=""/>
+      <w:lvlJc w:val="left"/>
+      <w:pPr>
+        <w:tabs>
+          <w:tab w:val="num" w:pos="2880"/>
+        </w:tabs>
+        <w:ind w:left="2880" w:hanging="360"/>
+      </w:pPr>
+      <w:rPr>
+        <w:rFonts w:ascii="Wingdings" w:hAnsi="Wingdings" w:hint="default"/>
+        <w:sz w:val="20"/>
+      </w:rPr>
+    </w:lvl>
+    <w:lvl w:ilvl="4" w:tentative="1">
+      <w:start w:val="1"/>
+      <w:numFmt w:val="bullet"/>
+      <w:lvlText w:val=""/>
+      <w:lvlJc w:val="left"/>
+      <w:pPr>
+        <w:tabs>
+          <w:tab w:val="num" w:pos="3600"/>
+        </w:tabs>
+        <w:ind w:left="3600" w:hanging="360"/>
+      </w:pPr>
+      <w:rPr>
+        <w:rFonts w:ascii="Wingdings" w:hAnsi="Wingdings" w:hint="default"/>
+        <w:sz w:val="20"/>
+      </w:rPr>
+    </w:lvl>
+    <w:lvl w:ilvl="5" w:tentative="1">
+      <w:start w:val="1"/>
+      <w:numFmt w:val="bullet"/>
+      <w:lvlText w:val=""/>
+      <w:lvlJc w:val="left"/>
+      <w:pPr>
+        <w:tabs>
+          <w:tab w:val="num" w:pos="4320"/>
+        </w:tabs>
+        <w:ind w:left="4320" w:hanging="360"/>
+      </w:pPr>
+      <w:rPr>
+        <w:rFonts w:ascii="Wingdings" w:hAnsi="Wingdings" w:hint="default"/>
+        <w:sz w:val="20"/>
+      </w:rPr>
+    </w:lvl>
+    <w:lvl w:ilvl="6" w:tentative="1">
+      <w:start w:val="1"/>
+      <w:numFmt w:val="bullet"/>
+      <w:lvlText w:val=""/>
+      <w:lvlJc w:val="left"/>
+      <w:pPr>
+        <w:tabs>
+          <w:tab w:val="num" w:pos="5040"/>
+        </w:tabs>
+        <w:ind w:left="5040" w:hanging="360"/>
+      </w:pPr>
+      <w:rPr>
+        <w:rFonts w:ascii="Wingdings" w:hAnsi="Wingdings" w:hint="default"/>
+        <w:sz w:val="20"/>
+      </w:rPr>
+    </w:lvl>
+    <w:lvl w:ilvl="7" w:tentative="1">
+      <w:start w:val="1"/>
+      <w:numFmt w:val="bullet"/>
+      <w:lvlText w:val=""/>
+      <w:lvlJc w:val="left"/>
+      <w:pPr>
+        <w:tabs>
+          <w:tab w:val="num" w:pos="5760"/>
+        </w:tabs>
+        <w:ind w:left="5760" w:hanging="360"/>
+      </w:pPr>
+      <w:rPr>
+        <w:rFonts w:ascii="Wingdings" w:hAnsi="Wingdings" w:hint="default"/>
+        <w:sz w:val="20"/>
+      </w:rPr>
+    </w:lvl>
+    <w:lvl w:ilvl="8" w:tentative="1">
+      <w:start w:val="1"/>
+      <w:numFmt w:val="bullet"/>
+      <w:lvlText w:val=""/>
+      <w:lvlJc w:val="left"/>
+      <w:pPr>
+        <w:tabs>
+          <w:tab w:val="num" w:pos="6480"/>
+        </w:tabs>
+        <w:ind w:left="6480" w:hanging="360"/>
+      </w:pPr>
+      <w:rPr>
+        <w:rFonts w:ascii="Wingdings" w:hAnsi="Wingdings" w:hint="default"/>
+        <w:sz w:val="20"/>
+      </w:rPr>
+    </w:lvl>
+  </w:abstractNum>
+  <w:abstractNum w:abstractNumId="23" w15:restartNumberingAfterBreak="0">
     <w:nsid w:val="44EC625B"/>
     <w:multiLevelType w:val="multilevel"/>
     <w:tmpl w:val="10DC1BE0"/>
@@ -3681,7 +5957,305 @@
       </w:rPr>
     </w:lvl>
   </w:abstractNum>
-  <w:abstractNum w:abstractNumId="15" w15:restartNumberingAfterBreak="0">
+  <w:abstractNum w:abstractNumId="24" w15:restartNumberingAfterBreak="0">
+    <w:nsid w:val="49D40D46"/>
+    <w:multiLevelType w:val="multilevel"/>
+    <w:tmpl w:val="CD6C507A"/>
+    <w:lvl w:ilvl="0">
+      <w:start w:val="1"/>
+      <w:numFmt w:val="bullet"/>
+      <w:lvlText w:val=""/>
+      <w:lvlJc w:val="left"/>
+      <w:pPr>
+        <w:tabs>
+          <w:tab w:val="num" w:pos="720"/>
+        </w:tabs>
+        <w:ind w:left="720" w:hanging="360"/>
+      </w:pPr>
+      <w:rPr>
+        <w:rFonts w:ascii="Symbol" w:hAnsi="Symbol" w:hint="default"/>
+        <w:sz w:val="20"/>
+      </w:rPr>
+    </w:lvl>
+    <w:lvl w:ilvl="1">
+      <w:start w:val="1"/>
+      <w:numFmt w:val="bullet"/>
+      <w:lvlText w:val="o"/>
+      <w:lvlJc w:val="left"/>
+      <w:pPr>
+        <w:tabs>
+          <w:tab w:val="num" w:pos="1440"/>
+        </w:tabs>
+        <w:ind w:left="1440" w:hanging="360"/>
+      </w:pPr>
+      <w:rPr>
+        <w:rFonts w:ascii="Courier New" w:hAnsi="Courier New" w:hint="default"/>
+        <w:sz w:val="20"/>
+      </w:rPr>
+    </w:lvl>
+    <w:lvl w:ilvl="2" w:tentative="1">
+      <w:start w:val="1"/>
+      <w:numFmt w:val="bullet"/>
+      <w:lvlText w:val=""/>
+      <w:lvlJc w:val="left"/>
+      <w:pPr>
+        <w:tabs>
+          <w:tab w:val="num" w:pos="2160"/>
+        </w:tabs>
+        <w:ind w:left="2160" w:hanging="360"/>
+      </w:pPr>
+      <w:rPr>
+        <w:rFonts w:ascii="Wingdings" w:hAnsi="Wingdings" w:hint="default"/>
+        <w:sz w:val="20"/>
+      </w:rPr>
+    </w:lvl>
+    <w:lvl w:ilvl="3" w:tentative="1">
+      <w:start w:val="1"/>
+      <w:numFmt w:val="bullet"/>
+      <w:lvlText w:val=""/>
+      <w:lvlJc w:val="left"/>
+      <w:pPr>
+        <w:tabs>
+          <w:tab w:val="num" w:pos="2880"/>
+        </w:tabs>
+        <w:ind w:left="2880" w:hanging="360"/>
+      </w:pPr>
+      <w:rPr>
+        <w:rFonts w:ascii="Wingdings" w:hAnsi="Wingdings" w:hint="default"/>
+        <w:sz w:val="20"/>
+      </w:rPr>
+    </w:lvl>
+    <w:lvl w:ilvl="4" w:tentative="1">
+      <w:start w:val="1"/>
+      <w:numFmt w:val="bullet"/>
+      <w:lvlText w:val=""/>
+      <w:lvlJc w:val="left"/>
+      <w:pPr>
+        <w:tabs>
+          <w:tab w:val="num" w:pos="3600"/>
+        </w:tabs>
+        <w:ind w:left="3600" w:hanging="360"/>
+      </w:pPr>
+      <w:rPr>
+        <w:rFonts w:ascii="Wingdings" w:hAnsi="Wingdings" w:hint="default"/>
+        <w:sz w:val="20"/>
+      </w:rPr>
+    </w:lvl>
+    <w:lvl w:ilvl="5" w:tentative="1">
+      <w:start w:val="1"/>
+      <w:numFmt w:val="bullet"/>
+      <w:lvlText w:val=""/>
+      <w:lvlJc w:val="left"/>
+      <w:pPr>
+        <w:tabs>
+          <w:tab w:val="num" w:pos="4320"/>
+        </w:tabs>
+        <w:ind w:left="4320" w:hanging="360"/>
+      </w:pPr>
+      <w:rPr>
+        <w:rFonts w:ascii="Wingdings" w:hAnsi="Wingdings" w:hint="default"/>
+        <w:sz w:val="20"/>
+      </w:rPr>
+    </w:lvl>
+    <w:lvl w:ilvl="6" w:tentative="1">
+      <w:start w:val="1"/>
+      <w:numFmt w:val="bullet"/>
+      <w:lvlText w:val=""/>
+      <w:lvlJc w:val="left"/>
+      <w:pPr>
+        <w:tabs>
+          <w:tab w:val="num" w:pos="5040"/>
+        </w:tabs>
+        <w:ind w:left="5040" w:hanging="360"/>
+      </w:pPr>
+      <w:rPr>
+        <w:rFonts w:ascii="Wingdings" w:hAnsi="Wingdings" w:hint="default"/>
+        <w:sz w:val="20"/>
+      </w:rPr>
+    </w:lvl>
+    <w:lvl w:ilvl="7" w:tentative="1">
+      <w:start w:val="1"/>
+      <w:numFmt w:val="bullet"/>
+      <w:lvlText w:val=""/>
+      <w:lvlJc w:val="left"/>
+      <w:pPr>
+        <w:tabs>
+          <w:tab w:val="num" w:pos="5760"/>
+        </w:tabs>
+        <w:ind w:left="5760" w:hanging="360"/>
+      </w:pPr>
+      <w:rPr>
+        <w:rFonts w:ascii="Wingdings" w:hAnsi="Wingdings" w:hint="default"/>
+        <w:sz w:val="20"/>
+      </w:rPr>
+    </w:lvl>
+    <w:lvl w:ilvl="8" w:tentative="1">
+      <w:start w:val="1"/>
+      <w:numFmt w:val="bullet"/>
+      <w:lvlText w:val=""/>
+      <w:lvlJc w:val="left"/>
+      <w:pPr>
+        <w:tabs>
+          <w:tab w:val="num" w:pos="6480"/>
+        </w:tabs>
+        <w:ind w:left="6480" w:hanging="360"/>
+      </w:pPr>
+      <w:rPr>
+        <w:rFonts w:ascii="Wingdings" w:hAnsi="Wingdings" w:hint="default"/>
+        <w:sz w:val="20"/>
+      </w:rPr>
+    </w:lvl>
+  </w:abstractNum>
+  <w:abstractNum w:abstractNumId="25" w15:restartNumberingAfterBreak="0">
+    <w:nsid w:val="4AAF4D9E"/>
+    <w:multiLevelType w:val="multilevel"/>
+    <w:tmpl w:val="B936F09C"/>
+    <w:lvl w:ilvl="0">
+      <w:start w:val="1"/>
+      <w:numFmt w:val="bullet"/>
+      <w:lvlText w:val=""/>
+      <w:lvlJc w:val="left"/>
+      <w:pPr>
+        <w:tabs>
+          <w:tab w:val="num" w:pos="720"/>
+        </w:tabs>
+        <w:ind w:left="720" w:hanging="360"/>
+      </w:pPr>
+      <w:rPr>
+        <w:rFonts w:ascii="Symbol" w:hAnsi="Symbol" w:hint="default"/>
+        <w:sz w:val="20"/>
+      </w:rPr>
+    </w:lvl>
+    <w:lvl w:ilvl="1" w:tentative="1">
+      <w:start w:val="1"/>
+      <w:numFmt w:val="bullet"/>
+      <w:lvlText w:val="o"/>
+      <w:lvlJc w:val="left"/>
+      <w:pPr>
+        <w:tabs>
+          <w:tab w:val="num" w:pos="1440"/>
+        </w:tabs>
+        <w:ind w:left="1440" w:hanging="360"/>
+      </w:pPr>
+      <w:rPr>
+        <w:rFonts w:ascii="Courier New" w:hAnsi="Courier New" w:hint="default"/>
+        <w:sz w:val="20"/>
+      </w:rPr>
+    </w:lvl>
+    <w:lvl w:ilvl="2" w:tentative="1">
+      <w:start w:val="1"/>
+      <w:numFmt w:val="bullet"/>
+      <w:lvlText w:val=""/>
+      <w:lvlJc w:val="left"/>
+      <w:pPr>
+        <w:tabs>
+          <w:tab w:val="num" w:pos="2160"/>
+        </w:tabs>
+        <w:ind w:left="2160" w:hanging="360"/>
+      </w:pPr>
+      <w:rPr>
+        <w:rFonts w:ascii="Wingdings" w:hAnsi="Wingdings" w:hint="default"/>
+        <w:sz w:val="20"/>
+      </w:rPr>
+    </w:lvl>
+    <w:lvl w:ilvl="3" w:tentative="1">
+      <w:start w:val="1"/>
+      <w:numFmt w:val="bullet"/>
+      <w:lvlText w:val=""/>
+      <w:lvlJc w:val="left"/>
+      <w:pPr>
+        <w:tabs>
+          <w:tab w:val="num" w:pos="2880"/>
+        </w:tabs>
+        <w:ind w:left="2880" w:hanging="360"/>
+      </w:pPr>
+      <w:rPr>
+        <w:rFonts w:ascii="Wingdings" w:hAnsi="Wingdings" w:hint="default"/>
+        <w:sz w:val="20"/>
+      </w:rPr>
+    </w:lvl>
+    <w:lvl w:ilvl="4" w:tentative="1">
+      <w:start w:val="1"/>
+      <w:numFmt w:val="bullet"/>
+      <w:lvlText w:val=""/>
+      <w:lvlJc w:val="left"/>
+      <w:pPr>
+        <w:tabs>
+          <w:tab w:val="num" w:pos="3600"/>
+        </w:tabs>
+        <w:ind w:left="3600" w:hanging="360"/>
+      </w:pPr>
+      <w:rPr>
+        <w:rFonts w:ascii="Wingdings" w:hAnsi="Wingdings" w:hint="default"/>
+        <w:sz w:val="20"/>
+      </w:rPr>
+    </w:lvl>
+    <w:lvl w:ilvl="5" w:tentative="1">
+      <w:start w:val="1"/>
+      <w:numFmt w:val="bullet"/>
+      <w:lvlText w:val=""/>
+      <w:lvlJc w:val="left"/>
+      <w:pPr>
+        <w:tabs>
+          <w:tab w:val="num" w:pos="4320"/>
+        </w:tabs>
+        <w:ind w:left="4320" w:hanging="360"/>
+      </w:pPr>
+      <w:rPr>
+        <w:rFonts w:ascii="Wingdings" w:hAnsi="Wingdings" w:hint="default"/>
+        <w:sz w:val="20"/>
+      </w:rPr>
+    </w:lvl>
+    <w:lvl w:ilvl="6" w:tentative="1">
+      <w:start w:val="1"/>
+      <w:numFmt w:val="bullet"/>
+      <w:lvlText w:val=""/>
+      <w:lvlJc w:val="left"/>
+      <w:pPr>
+        <w:tabs>
+          <w:tab w:val="num" w:pos="5040"/>
+        </w:tabs>
+        <w:ind w:left="5040" w:hanging="360"/>
+      </w:pPr>
+      <w:rPr>
+        <w:rFonts w:ascii="Wingdings" w:hAnsi="Wingdings" w:hint="default"/>
+        <w:sz w:val="20"/>
+      </w:rPr>
+    </w:lvl>
+    <w:lvl w:ilvl="7" w:tentative="1">
+      <w:start w:val="1"/>
+      <w:numFmt w:val="bullet"/>
+      <w:lvlText w:val=""/>
+      <w:lvlJc w:val="left"/>
+      <w:pPr>
+        <w:tabs>
+          <w:tab w:val="num" w:pos="5760"/>
+        </w:tabs>
+        <w:ind w:left="5760" w:hanging="360"/>
+      </w:pPr>
+      <w:rPr>
+        <w:rFonts w:ascii="Wingdings" w:hAnsi="Wingdings" w:hint="default"/>
+        <w:sz w:val="20"/>
+      </w:rPr>
+    </w:lvl>
+    <w:lvl w:ilvl="8" w:tentative="1">
+      <w:start w:val="1"/>
+      <w:numFmt w:val="bullet"/>
+      <w:lvlText w:val=""/>
+      <w:lvlJc w:val="left"/>
+      <w:pPr>
+        <w:tabs>
+          <w:tab w:val="num" w:pos="6480"/>
+        </w:tabs>
+        <w:ind w:left="6480" w:hanging="360"/>
+      </w:pPr>
+      <w:rPr>
+        <w:rFonts w:ascii="Wingdings" w:hAnsi="Wingdings" w:hint="default"/>
+        <w:sz w:val="20"/>
+      </w:rPr>
+    </w:lvl>
+  </w:abstractNum>
+  <w:abstractNum w:abstractNumId="26" w15:restartNumberingAfterBreak="0">
     <w:nsid w:val="4F9E1B7A"/>
     <w:multiLevelType w:val="multilevel"/>
     <w:tmpl w:val="B3A8C280"/>
@@ -3830,7 +6404,7 @@
       </w:rPr>
     </w:lvl>
   </w:abstractNum>
-  <w:abstractNum w:abstractNumId="16" w15:restartNumberingAfterBreak="0">
+  <w:abstractNum w:abstractNumId="27" w15:restartNumberingAfterBreak="0">
     <w:nsid w:val="54045E8D"/>
     <w:multiLevelType w:val="multilevel"/>
     <w:tmpl w:val="2214E104"/>
@@ -3979,7 +6553,7 @@
       </w:rPr>
     </w:lvl>
   </w:abstractNum>
-  <w:abstractNum w:abstractNumId="17" w15:restartNumberingAfterBreak="0">
+  <w:abstractNum w:abstractNumId="28" w15:restartNumberingAfterBreak="0">
     <w:nsid w:val="543F330E"/>
     <w:multiLevelType w:val="multilevel"/>
     <w:tmpl w:val="DC6E1A1A"/>
@@ -4128,7 +6702,7 @@
       </w:rPr>
     </w:lvl>
   </w:abstractNum>
-  <w:abstractNum w:abstractNumId="18" w15:restartNumberingAfterBreak="0">
+  <w:abstractNum w:abstractNumId="29" w15:restartNumberingAfterBreak="0">
     <w:nsid w:val="549B0806"/>
     <w:multiLevelType w:val="multilevel"/>
     <w:tmpl w:val="0DFC01F4"/>
@@ -4277,7 +6851,156 @@
       </w:rPr>
     </w:lvl>
   </w:abstractNum>
-  <w:abstractNum w:abstractNumId="19" w15:restartNumberingAfterBreak="0">
+  <w:abstractNum w:abstractNumId="30" w15:restartNumberingAfterBreak="0">
+    <w:nsid w:val="54BB638E"/>
+    <w:multiLevelType w:val="multilevel"/>
+    <w:tmpl w:val="371445D6"/>
+    <w:lvl w:ilvl="0">
+      <w:start w:val="1"/>
+      <w:numFmt w:val="bullet"/>
+      <w:lvlText w:val=""/>
+      <w:lvlJc w:val="left"/>
+      <w:pPr>
+        <w:tabs>
+          <w:tab w:val="num" w:pos="720"/>
+        </w:tabs>
+        <w:ind w:left="720" w:hanging="360"/>
+      </w:pPr>
+      <w:rPr>
+        <w:rFonts w:ascii="Symbol" w:hAnsi="Symbol" w:hint="default"/>
+        <w:sz w:val="20"/>
+      </w:rPr>
+    </w:lvl>
+    <w:lvl w:ilvl="1">
+      <w:start w:val="1"/>
+      <w:numFmt w:val="bullet"/>
+      <w:lvlText w:val="o"/>
+      <w:lvlJc w:val="left"/>
+      <w:pPr>
+        <w:tabs>
+          <w:tab w:val="num" w:pos="1440"/>
+        </w:tabs>
+        <w:ind w:left="1440" w:hanging="360"/>
+      </w:pPr>
+      <w:rPr>
+        <w:rFonts w:ascii="Courier New" w:hAnsi="Courier New" w:hint="default"/>
+        <w:sz w:val="20"/>
+      </w:rPr>
+    </w:lvl>
+    <w:lvl w:ilvl="2" w:tentative="1">
+      <w:start w:val="1"/>
+      <w:numFmt w:val="bullet"/>
+      <w:lvlText w:val=""/>
+      <w:lvlJc w:val="left"/>
+      <w:pPr>
+        <w:tabs>
+          <w:tab w:val="num" w:pos="2160"/>
+        </w:tabs>
+        <w:ind w:left="2160" w:hanging="360"/>
+      </w:pPr>
+      <w:rPr>
+        <w:rFonts w:ascii="Wingdings" w:hAnsi="Wingdings" w:hint="default"/>
+        <w:sz w:val="20"/>
+      </w:rPr>
+    </w:lvl>
+    <w:lvl w:ilvl="3" w:tentative="1">
+      <w:start w:val="1"/>
+      <w:numFmt w:val="bullet"/>
+      <w:lvlText w:val=""/>
+      <w:lvlJc w:val="left"/>
+      <w:pPr>
+        <w:tabs>
+          <w:tab w:val="num" w:pos="2880"/>
+        </w:tabs>
+        <w:ind w:left="2880" w:hanging="360"/>
+      </w:pPr>
+      <w:rPr>
+        <w:rFonts w:ascii="Wingdings" w:hAnsi="Wingdings" w:hint="default"/>
+        <w:sz w:val="20"/>
+      </w:rPr>
+    </w:lvl>
+    <w:lvl w:ilvl="4" w:tentative="1">
+      <w:start w:val="1"/>
+      <w:numFmt w:val="bullet"/>
+      <w:lvlText w:val=""/>
+      <w:lvlJc w:val="left"/>
+      <w:pPr>
+        <w:tabs>
+          <w:tab w:val="num" w:pos="3600"/>
+        </w:tabs>
+        <w:ind w:left="3600" w:hanging="360"/>
+      </w:pPr>
+      <w:rPr>
+        <w:rFonts w:ascii="Wingdings" w:hAnsi="Wingdings" w:hint="default"/>
+        <w:sz w:val="20"/>
+      </w:rPr>
+    </w:lvl>
+    <w:lvl w:ilvl="5" w:tentative="1">
+      <w:start w:val="1"/>
+      <w:numFmt w:val="bullet"/>
+      <w:lvlText w:val=""/>
+      <w:lvlJc w:val="left"/>
+      <w:pPr>
+        <w:tabs>
+          <w:tab w:val="num" w:pos="4320"/>
+        </w:tabs>
+        <w:ind w:left="4320" w:hanging="360"/>
+      </w:pPr>
+      <w:rPr>
+        <w:rFonts w:ascii="Wingdings" w:hAnsi="Wingdings" w:hint="default"/>
+        <w:sz w:val="20"/>
+      </w:rPr>
+    </w:lvl>
+    <w:lvl w:ilvl="6" w:tentative="1">
+      <w:start w:val="1"/>
+      <w:numFmt w:val="bullet"/>
+      <w:lvlText w:val=""/>
+      <w:lvlJc w:val="left"/>
+      <w:pPr>
+        <w:tabs>
+          <w:tab w:val="num" w:pos="5040"/>
+        </w:tabs>
+        <w:ind w:left="5040" w:hanging="360"/>
+      </w:pPr>
+      <w:rPr>
+        <w:rFonts w:ascii="Wingdings" w:hAnsi="Wingdings" w:hint="default"/>
+        <w:sz w:val="20"/>
+      </w:rPr>
+    </w:lvl>
+    <w:lvl w:ilvl="7" w:tentative="1">
+      <w:start w:val="1"/>
+      <w:numFmt w:val="bullet"/>
+      <w:lvlText w:val=""/>
+      <w:lvlJc w:val="left"/>
+      <w:pPr>
+        <w:tabs>
+          <w:tab w:val="num" w:pos="5760"/>
+        </w:tabs>
+        <w:ind w:left="5760" w:hanging="360"/>
+      </w:pPr>
+      <w:rPr>
+        <w:rFonts w:ascii="Wingdings" w:hAnsi="Wingdings" w:hint="default"/>
+        <w:sz w:val="20"/>
+      </w:rPr>
+    </w:lvl>
+    <w:lvl w:ilvl="8" w:tentative="1">
+      <w:start w:val="1"/>
+      <w:numFmt w:val="bullet"/>
+      <w:lvlText w:val=""/>
+      <w:lvlJc w:val="left"/>
+      <w:pPr>
+        <w:tabs>
+          <w:tab w:val="num" w:pos="6480"/>
+        </w:tabs>
+        <w:ind w:left="6480" w:hanging="360"/>
+      </w:pPr>
+      <w:rPr>
+        <w:rFonts w:ascii="Wingdings" w:hAnsi="Wingdings" w:hint="default"/>
+        <w:sz w:val="20"/>
+      </w:rPr>
+    </w:lvl>
+  </w:abstractNum>
+  <w:abstractNum w:abstractNumId="31" w15:restartNumberingAfterBreak="0">
     <w:nsid w:val="596D649E"/>
     <w:multiLevelType w:val="multilevel"/>
     <w:tmpl w:val="B13827E8"/>
@@ -4426,7 +7149,156 @@
       </w:rPr>
     </w:lvl>
   </w:abstractNum>
-  <w:abstractNum w:abstractNumId="20" w15:restartNumberingAfterBreak="0">
+  <w:abstractNum w:abstractNumId="32" w15:restartNumberingAfterBreak="0">
+    <w:nsid w:val="60305728"/>
+    <w:multiLevelType w:val="multilevel"/>
+    <w:tmpl w:val="C974EBDC"/>
+    <w:lvl w:ilvl="0">
+      <w:start w:val="1"/>
+      <w:numFmt w:val="bullet"/>
+      <w:lvlText w:val=""/>
+      <w:lvlJc w:val="left"/>
+      <w:pPr>
+        <w:tabs>
+          <w:tab w:val="num" w:pos="720"/>
+        </w:tabs>
+        <w:ind w:left="720" w:hanging="360"/>
+      </w:pPr>
+      <w:rPr>
+        <w:rFonts w:ascii="Symbol" w:hAnsi="Symbol" w:hint="default"/>
+        <w:sz w:val="20"/>
+      </w:rPr>
+    </w:lvl>
+    <w:lvl w:ilvl="1" w:tentative="1">
+      <w:start w:val="1"/>
+      <w:numFmt w:val="bullet"/>
+      <w:lvlText w:val="o"/>
+      <w:lvlJc w:val="left"/>
+      <w:pPr>
+        <w:tabs>
+          <w:tab w:val="num" w:pos="1440"/>
+        </w:tabs>
+        <w:ind w:left="1440" w:hanging="360"/>
+      </w:pPr>
+      <w:rPr>
+        <w:rFonts w:ascii="Courier New" w:hAnsi="Courier New" w:hint="default"/>
+        <w:sz w:val="20"/>
+      </w:rPr>
+    </w:lvl>
+    <w:lvl w:ilvl="2" w:tentative="1">
+      <w:start w:val="1"/>
+      <w:numFmt w:val="bullet"/>
+      <w:lvlText w:val=""/>
+      <w:lvlJc w:val="left"/>
+      <w:pPr>
+        <w:tabs>
+          <w:tab w:val="num" w:pos="2160"/>
+        </w:tabs>
+        <w:ind w:left="2160" w:hanging="360"/>
+      </w:pPr>
+      <w:rPr>
+        <w:rFonts w:ascii="Wingdings" w:hAnsi="Wingdings" w:hint="default"/>
+        <w:sz w:val="20"/>
+      </w:rPr>
+    </w:lvl>
+    <w:lvl w:ilvl="3" w:tentative="1">
+      <w:start w:val="1"/>
+      <w:numFmt w:val="bullet"/>
+      <w:lvlText w:val=""/>
+      <w:lvlJc w:val="left"/>
+      <w:pPr>
+        <w:tabs>
+          <w:tab w:val="num" w:pos="2880"/>
+        </w:tabs>
+        <w:ind w:left="2880" w:hanging="360"/>
+      </w:pPr>
+      <w:rPr>
+        <w:rFonts w:ascii="Wingdings" w:hAnsi="Wingdings" w:hint="default"/>
+        <w:sz w:val="20"/>
+      </w:rPr>
+    </w:lvl>
+    <w:lvl w:ilvl="4" w:tentative="1">
+      <w:start w:val="1"/>
+      <w:numFmt w:val="bullet"/>
+      <w:lvlText w:val=""/>
+      <w:lvlJc w:val="left"/>
+      <w:pPr>
+        <w:tabs>
+          <w:tab w:val="num" w:pos="3600"/>
+        </w:tabs>
+        <w:ind w:left="3600" w:hanging="360"/>
+      </w:pPr>
+      <w:rPr>
+        <w:rFonts w:ascii="Wingdings" w:hAnsi="Wingdings" w:hint="default"/>
+        <w:sz w:val="20"/>
+      </w:rPr>
+    </w:lvl>
+    <w:lvl w:ilvl="5" w:tentative="1">
+      <w:start w:val="1"/>
+      <w:numFmt w:val="bullet"/>
+      <w:lvlText w:val=""/>
+      <w:lvlJc w:val="left"/>
+      <w:pPr>
+        <w:tabs>
+          <w:tab w:val="num" w:pos="4320"/>
+        </w:tabs>
+        <w:ind w:left="4320" w:hanging="360"/>
+      </w:pPr>
+      <w:rPr>
+        <w:rFonts w:ascii="Wingdings" w:hAnsi="Wingdings" w:hint="default"/>
+        <w:sz w:val="20"/>
+      </w:rPr>
+    </w:lvl>
+    <w:lvl w:ilvl="6" w:tentative="1">
+      <w:start w:val="1"/>
+      <w:numFmt w:val="bullet"/>
+      <w:lvlText w:val=""/>
+      <w:lvlJc w:val="left"/>
+      <w:pPr>
+        <w:tabs>
+          <w:tab w:val="num" w:pos="5040"/>
+        </w:tabs>
+        <w:ind w:left="5040" w:hanging="360"/>
+      </w:pPr>
+      <w:rPr>
+        <w:rFonts w:ascii="Wingdings" w:hAnsi="Wingdings" w:hint="default"/>
+        <w:sz w:val="20"/>
+      </w:rPr>
+    </w:lvl>
+    <w:lvl w:ilvl="7" w:tentative="1">
+      <w:start w:val="1"/>
+      <w:numFmt w:val="bullet"/>
+      <w:lvlText w:val=""/>
+      <w:lvlJc w:val="left"/>
+      <w:pPr>
+        <w:tabs>
+          <w:tab w:val="num" w:pos="5760"/>
+        </w:tabs>
+        <w:ind w:left="5760" w:hanging="360"/>
+      </w:pPr>
+      <w:rPr>
+        <w:rFonts w:ascii="Wingdings" w:hAnsi="Wingdings" w:hint="default"/>
+        <w:sz w:val="20"/>
+      </w:rPr>
+    </w:lvl>
+    <w:lvl w:ilvl="8" w:tentative="1">
+      <w:start w:val="1"/>
+      <w:numFmt w:val="bullet"/>
+      <w:lvlText w:val=""/>
+      <w:lvlJc w:val="left"/>
+      <w:pPr>
+        <w:tabs>
+          <w:tab w:val="num" w:pos="6480"/>
+        </w:tabs>
+        <w:ind w:left="6480" w:hanging="360"/>
+      </w:pPr>
+      <w:rPr>
+        <w:rFonts w:ascii="Wingdings" w:hAnsi="Wingdings" w:hint="default"/>
+        <w:sz w:val="20"/>
+      </w:rPr>
+    </w:lvl>
+  </w:abstractNum>
+  <w:abstractNum w:abstractNumId="33" w15:restartNumberingAfterBreak="0">
     <w:nsid w:val="61C4604E"/>
     <w:multiLevelType w:val="multilevel"/>
     <w:tmpl w:val="910294F0"/>
@@ -4575,7 +7447,7 @@
       </w:rPr>
     </w:lvl>
   </w:abstractNum>
-  <w:abstractNum w:abstractNumId="21" w15:restartNumberingAfterBreak="0">
+  <w:abstractNum w:abstractNumId="34" w15:restartNumberingAfterBreak="0">
     <w:nsid w:val="638541E6"/>
     <w:multiLevelType w:val="multilevel"/>
     <w:tmpl w:val="CC6A9CD8"/>
@@ -4724,7 +7596,7 @@
       </w:rPr>
     </w:lvl>
   </w:abstractNum>
-  <w:abstractNum w:abstractNumId="22" w15:restartNumberingAfterBreak="0">
+  <w:abstractNum w:abstractNumId="35" w15:restartNumberingAfterBreak="0">
     <w:nsid w:val="6D02343B"/>
     <w:multiLevelType w:val="multilevel"/>
     <w:tmpl w:val="CF126B16"/>
@@ -4873,7 +7745,7 @@
       </w:rPr>
     </w:lvl>
   </w:abstractNum>
-  <w:abstractNum w:abstractNumId="23" w15:restartNumberingAfterBreak="0">
+  <w:abstractNum w:abstractNumId="36" w15:restartNumberingAfterBreak="0">
     <w:nsid w:val="74BE7F6A"/>
     <w:multiLevelType w:val="multilevel"/>
     <w:tmpl w:val="913AD416"/>
@@ -5022,7 +7894,7 @@
       </w:rPr>
     </w:lvl>
   </w:abstractNum>
-  <w:abstractNum w:abstractNumId="24" w15:restartNumberingAfterBreak="0">
+  <w:abstractNum w:abstractNumId="37" w15:restartNumberingAfterBreak="0">
     <w:nsid w:val="75046EF1"/>
     <w:multiLevelType w:val="multilevel"/>
     <w:tmpl w:val="C144DFFE"/>
@@ -5171,80 +8043,423 @@
       </w:rPr>
     </w:lvl>
   </w:abstractNum>
+  <w:abstractNum w:abstractNumId="38" w15:restartNumberingAfterBreak="0">
+    <w:nsid w:val="7A82208D"/>
+    <w:multiLevelType w:val="multilevel"/>
+    <w:tmpl w:val="CE52C3F4"/>
+    <w:lvl w:ilvl="0">
+      <w:start w:val="1"/>
+      <w:numFmt w:val="bullet"/>
+      <w:lvlText w:val=""/>
+      <w:lvlJc w:val="left"/>
+      <w:pPr>
+        <w:tabs>
+          <w:tab w:val="num" w:pos="720"/>
+        </w:tabs>
+        <w:ind w:left="720" w:hanging="360"/>
+      </w:pPr>
+      <w:rPr>
+        <w:rFonts w:ascii="Symbol" w:hAnsi="Symbol" w:hint="default"/>
+        <w:sz w:val="20"/>
+      </w:rPr>
+    </w:lvl>
+    <w:lvl w:ilvl="1">
+      <w:start w:val="1"/>
+      <w:numFmt w:val="bullet"/>
+      <w:lvlText w:val="o"/>
+      <w:lvlJc w:val="left"/>
+      <w:pPr>
+        <w:tabs>
+          <w:tab w:val="num" w:pos="1440"/>
+        </w:tabs>
+        <w:ind w:left="1440" w:hanging="360"/>
+      </w:pPr>
+      <w:rPr>
+        <w:rFonts w:ascii="Courier New" w:hAnsi="Courier New" w:hint="default"/>
+        <w:sz w:val="20"/>
+      </w:rPr>
+    </w:lvl>
+    <w:lvl w:ilvl="2" w:tentative="1">
+      <w:start w:val="1"/>
+      <w:numFmt w:val="bullet"/>
+      <w:lvlText w:val=""/>
+      <w:lvlJc w:val="left"/>
+      <w:pPr>
+        <w:tabs>
+          <w:tab w:val="num" w:pos="2160"/>
+        </w:tabs>
+        <w:ind w:left="2160" w:hanging="360"/>
+      </w:pPr>
+      <w:rPr>
+        <w:rFonts w:ascii="Wingdings" w:hAnsi="Wingdings" w:hint="default"/>
+        <w:sz w:val="20"/>
+      </w:rPr>
+    </w:lvl>
+    <w:lvl w:ilvl="3" w:tentative="1">
+      <w:start w:val="1"/>
+      <w:numFmt w:val="bullet"/>
+      <w:lvlText w:val=""/>
+      <w:lvlJc w:val="left"/>
+      <w:pPr>
+        <w:tabs>
+          <w:tab w:val="num" w:pos="2880"/>
+        </w:tabs>
+        <w:ind w:left="2880" w:hanging="360"/>
+      </w:pPr>
+      <w:rPr>
+        <w:rFonts w:ascii="Wingdings" w:hAnsi="Wingdings" w:hint="default"/>
+        <w:sz w:val="20"/>
+      </w:rPr>
+    </w:lvl>
+    <w:lvl w:ilvl="4" w:tentative="1">
+      <w:start w:val="1"/>
+      <w:numFmt w:val="bullet"/>
+      <w:lvlText w:val=""/>
+      <w:lvlJc w:val="left"/>
+      <w:pPr>
+        <w:tabs>
+          <w:tab w:val="num" w:pos="3600"/>
+        </w:tabs>
+        <w:ind w:left="3600" w:hanging="360"/>
+      </w:pPr>
+      <w:rPr>
+        <w:rFonts w:ascii="Wingdings" w:hAnsi="Wingdings" w:hint="default"/>
+        <w:sz w:val="20"/>
+      </w:rPr>
+    </w:lvl>
+    <w:lvl w:ilvl="5" w:tentative="1">
+      <w:start w:val="1"/>
+      <w:numFmt w:val="bullet"/>
+      <w:lvlText w:val=""/>
+      <w:lvlJc w:val="left"/>
+      <w:pPr>
+        <w:tabs>
+          <w:tab w:val="num" w:pos="4320"/>
+        </w:tabs>
+        <w:ind w:left="4320" w:hanging="360"/>
+      </w:pPr>
+      <w:rPr>
+        <w:rFonts w:ascii="Wingdings" w:hAnsi="Wingdings" w:hint="default"/>
+        <w:sz w:val="20"/>
+      </w:rPr>
+    </w:lvl>
+    <w:lvl w:ilvl="6" w:tentative="1">
+      <w:start w:val="1"/>
+      <w:numFmt w:val="bullet"/>
+      <w:lvlText w:val=""/>
+      <w:lvlJc w:val="left"/>
+      <w:pPr>
+        <w:tabs>
+          <w:tab w:val="num" w:pos="5040"/>
+        </w:tabs>
+        <w:ind w:left="5040" w:hanging="360"/>
+      </w:pPr>
+      <w:rPr>
+        <w:rFonts w:ascii="Wingdings" w:hAnsi="Wingdings" w:hint="default"/>
+        <w:sz w:val="20"/>
+      </w:rPr>
+    </w:lvl>
+    <w:lvl w:ilvl="7" w:tentative="1">
+      <w:start w:val="1"/>
+      <w:numFmt w:val="bullet"/>
+      <w:lvlText w:val=""/>
+      <w:lvlJc w:val="left"/>
+      <w:pPr>
+        <w:tabs>
+          <w:tab w:val="num" w:pos="5760"/>
+        </w:tabs>
+        <w:ind w:left="5760" w:hanging="360"/>
+      </w:pPr>
+      <w:rPr>
+        <w:rFonts w:ascii="Wingdings" w:hAnsi="Wingdings" w:hint="default"/>
+        <w:sz w:val="20"/>
+      </w:rPr>
+    </w:lvl>
+    <w:lvl w:ilvl="8" w:tentative="1">
+      <w:start w:val="1"/>
+      <w:numFmt w:val="bullet"/>
+      <w:lvlText w:val=""/>
+      <w:lvlJc w:val="left"/>
+      <w:pPr>
+        <w:tabs>
+          <w:tab w:val="num" w:pos="6480"/>
+        </w:tabs>
+        <w:ind w:left="6480" w:hanging="360"/>
+      </w:pPr>
+      <w:rPr>
+        <w:rFonts w:ascii="Wingdings" w:hAnsi="Wingdings" w:hint="default"/>
+        <w:sz w:val="20"/>
+      </w:rPr>
+    </w:lvl>
+  </w:abstractNum>
+  <w:abstractNum w:abstractNumId="39" w15:restartNumberingAfterBreak="0">
+    <w:nsid w:val="7CAD5916"/>
+    <w:multiLevelType w:val="multilevel"/>
+    <w:tmpl w:val="E9D4FE1E"/>
+    <w:lvl w:ilvl="0">
+      <w:start w:val="1"/>
+      <w:numFmt w:val="bullet"/>
+      <w:lvlText w:val=""/>
+      <w:lvlJc w:val="left"/>
+      <w:pPr>
+        <w:tabs>
+          <w:tab w:val="num" w:pos="720"/>
+        </w:tabs>
+        <w:ind w:left="720" w:hanging="360"/>
+      </w:pPr>
+      <w:rPr>
+        <w:rFonts w:ascii="Symbol" w:hAnsi="Symbol" w:hint="default"/>
+        <w:sz w:val="20"/>
+      </w:rPr>
+    </w:lvl>
+    <w:lvl w:ilvl="1" w:tentative="1">
+      <w:start w:val="1"/>
+      <w:numFmt w:val="bullet"/>
+      <w:lvlText w:val="o"/>
+      <w:lvlJc w:val="left"/>
+      <w:pPr>
+        <w:tabs>
+          <w:tab w:val="num" w:pos="1440"/>
+        </w:tabs>
+        <w:ind w:left="1440" w:hanging="360"/>
+      </w:pPr>
+      <w:rPr>
+        <w:rFonts w:ascii="Courier New" w:hAnsi="Courier New" w:hint="default"/>
+        <w:sz w:val="20"/>
+      </w:rPr>
+    </w:lvl>
+    <w:lvl w:ilvl="2" w:tentative="1">
+      <w:start w:val="1"/>
+      <w:numFmt w:val="bullet"/>
+      <w:lvlText w:val=""/>
+      <w:lvlJc w:val="left"/>
+      <w:pPr>
+        <w:tabs>
+          <w:tab w:val="num" w:pos="2160"/>
+        </w:tabs>
+        <w:ind w:left="2160" w:hanging="360"/>
+      </w:pPr>
+      <w:rPr>
+        <w:rFonts w:ascii="Wingdings" w:hAnsi="Wingdings" w:hint="default"/>
+        <w:sz w:val="20"/>
+      </w:rPr>
+    </w:lvl>
+    <w:lvl w:ilvl="3" w:tentative="1">
+      <w:start w:val="1"/>
+      <w:numFmt w:val="bullet"/>
+      <w:lvlText w:val=""/>
+      <w:lvlJc w:val="left"/>
+      <w:pPr>
+        <w:tabs>
+          <w:tab w:val="num" w:pos="2880"/>
+        </w:tabs>
+        <w:ind w:left="2880" w:hanging="360"/>
+      </w:pPr>
+      <w:rPr>
+        <w:rFonts w:ascii="Wingdings" w:hAnsi="Wingdings" w:hint="default"/>
+        <w:sz w:val="20"/>
+      </w:rPr>
+    </w:lvl>
+    <w:lvl w:ilvl="4" w:tentative="1">
+      <w:start w:val="1"/>
+      <w:numFmt w:val="bullet"/>
+      <w:lvlText w:val=""/>
+      <w:lvlJc w:val="left"/>
+      <w:pPr>
+        <w:tabs>
+          <w:tab w:val="num" w:pos="3600"/>
+        </w:tabs>
+        <w:ind w:left="3600" w:hanging="360"/>
+      </w:pPr>
+      <w:rPr>
+        <w:rFonts w:ascii="Wingdings" w:hAnsi="Wingdings" w:hint="default"/>
+        <w:sz w:val="20"/>
+      </w:rPr>
+    </w:lvl>
+    <w:lvl w:ilvl="5" w:tentative="1">
+      <w:start w:val="1"/>
+      <w:numFmt w:val="bullet"/>
+      <w:lvlText w:val=""/>
+      <w:lvlJc w:val="left"/>
+      <w:pPr>
+        <w:tabs>
+          <w:tab w:val="num" w:pos="4320"/>
+        </w:tabs>
+        <w:ind w:left="4320" w:hanging="360"/>
+      </w:pPr>
+      <w:rPr>
+        <w:rFonts w:ascii="Wingdings" w:hAnsi="Wingdings" w:hint="default"/>
+        <w:sz w:val="20"/>
+      </w:rPr>
+    </w:lvl>
+    <w:lvl w:ilvl="6" w:tentative="1">
+      <w:start w:val="1"/>
+      <w:numFmt w:val="bullet"/>
+      <w:lvlText w:val=""/>
+      <w:lvlJc w:val="left"/>
+      <w:pPr>
+        <w:tabs>
+          <w:tab w:val="num" w:pos="5040"/>
+        </w:tabs>
+        <w:ind w:left="5040" w:hanging="360"/>
+      </w:pPr>
+      <w:rPr>
+        <w:rFonts w:ascii="Wingdings" w:hAnsi="Wingdings" w:hint="default"/>
+        <w:sz w:val="20"/>
+      </w:rPr>
+    </w:lvl>
+    <w:lvl w:ilvl="7" w:tentative="1">
+      <w:start w:val="1"/>
+      <w:numFmt w:val="bullet"/>
+      <w:lvlText w:val=""/>
+      <w:lvlJc w:val="left"/>
+      <w:pPr>
+        <w:tabs>
+          <w:tab w:val="num" w:pos="5760"/>
+        </w:tabs>
+        <w:ind w:left="5760" w:hanging="360"/>
+      </w:pPr>
+      <w:rPr>
+        <w:rFonts w:ascii="Wingdings" w:hAnsi="Wingdings" w:hint="default"/>
+        <w:sz w:val="20"/>
+      </w:rPr>
+    </w:lvl>
+    <w:lvl w:ilvl="8" w:tentative="1">
+      <w:start w:val="1"/>
+      <w:numFmt w:val="bullet"/>
+      <w:lvlText w:val=""/>
+      <w:lvlJc w:val="left"/>
+      <w:pPr>
+        <w:tabs>
+          <w:tab w:val="num" w:pos="6480"/>
+        </w:tabs>
+        <w:ind w:left="6480" w:hanging="360"/>
+      </w:pPr>
+      <w:rPr>
+        <w:rFonts w:ascii="Wingdings" w:hAnsi="Wingdings" w:hint="default"/>
+        <w:sz w:val="20"/>
+      </w:rPr>
+    </w:lvl>
+  </w:abstractNum>
   <w:num w:numId="1" w16cid:durableId="1546790329">
-    <w:abstractNumId w:val="13"/>
+    <w:abstractNumId w:val="16"/>
   </w:num>
   <w:num w:numId="2" w16cid:durableId="1687101485">
-    <w:abstractNumId w:val="22"/>
+    <w:abstractNumId w:val="35"/>
   </w:num>
   <w:num w:numId="3" w16cid:durableId="490102699">
+    <w:abstractNumId w:val="10"/>
+  </w:num>
+  <w:num w:numId="4" w16cid:durableId="1253465186">
+    <w:abstractNumId w:val="37"/>
+  </w:num>
+  <w:num w:numId="5" w16cid:durableId="19547807">
+    <w:abstractNumId w:val="27"/>
+  </w:num>
+  <w:num w:numId="6" w16cid:durableId="1366129510">
+    <w:abstractNumId w:val="3"/>
+  </w:num>
+  <w:num w:numId="7" w16cid:durableId="827549671">
+    <w:abstractNumId w:val="26"/>
+  </w:num>
+  <w:num w:numId="8" w16cid:durableId="1401517661">
+    <w:abstractNumId w:val="28"/>
+  </w:num>
+  <w:num w:numId="9" w16cid:durableId="409893154">
+    <w:abstractNumId w:val="4"/>
+  </w:num>
+  <w:num w:numId="10" w16cid:durableId="683022688">
+    <w:abstractNumId w:val="29"/>
+  </w:num>
+  <w:num w:numId="11" w16cid:durableId="1466771846">
+    <w:abstractNumId w:val="9"/>
+  </w:num>
+  <w:num w:numId="12" w16cid:durableId="656375280">
+    <w:abstractNumId w:val="8"/>
+  </w:num>
+  <w:num w:numId="13" w16cid:durableId="1721519530">
+    <w:abstractNumId w:val="14"/>
+  </w:num>
+  <w:num w:numId="14" w16cid:durableId="1425880299">
+    <w:abstractNumId w:val="23"/>
+  </w:num>
+  <w:num w:numId="15" w16cid:durableId="1462188773">
+    <w:abstractNumId w:val="34"/>
+  </w:num>
+  <w:num w:numId="16" w16cid:durableId="1745444197">
+    <w:abstractNumId w:val="12"/>
+  </w:num>
+  <w:num w:numId="17" w16cid:durableId="145174869">
+    <w:abstractNumId w:val="11"/>
+  </w:num>
+  <w:num w:numId="18" w16cid:durableId="866261881">
+    <w:abstractNumId w:val="31"/>
+  </w:num>
+  <w:num w:numId="19" w16cid:durableId="170609978">
     <w:abstractNumId w:val="7"/>
   </w:num>
-  <w:num w:numId="4" w16cid:durableId="1253465186">
-    <w:abstractNumId w:val="24"/>
-  </w:num>
-  <w:num w:numId="5" w16cid:durableId="19547807">
-    <w:abstractNumId w:val="16"/>
-  </w:num>
-  <w:num w:numId="6" w16cid:durableId="1366129510">
-    <w:abstractNumId w:val="1"/>
-  </w:num>
-  <w:num w:numId="7" w16cid:durableId="827549671">
-    <w:abstractNumId w:val="15"/>
-  </w:num>
-  <w:num w:numId="8" w16cid:durableId="1401517661">
-    <w:abstractNumId w:val="17"/>
-  </w:num>
-  <w:num w:numId="9" w16cid:durableId="409893154">
-    <w:abstractNumId w:val="2"/>
-  </w:num>
-  <w:num w:numId="10" w16cid:durableId="683022688">
-    <w:abstractNumId w:val="18"/>
-  </w:num>
-  <w:num w:numId="11" w16cid:durableId="1466771846">
-    <w:abstractNumId w:val="6"/>
-  </w:num>
-  <w:num w:numId="12" w16cid:durableId="656375280">
-    <w:abstractNumId w:val="5"/>
-  </w:num>
-  <w:num w:numId="13" w16cid:durableId="1721519530">
-    <w:abstractNumId w:val="11"/>
-  </w:num>
-  <w:num w:numId="14" w16cid:durableId="1425880299">
-    <w:abstractNumId w:val="14"/>
-  </w:num>
-  <w:num w:numId="15" w16cid:durableId="1462188773">
-    <w:abstractNumId w:val="21"/>
-  </w:num>
-  <w:num w:numId="16" w16cid:durableId="1745444197">
-    <w:abstractNumId w:val="9"/>
-  </w:num>
-  <w:num w:numId="17" w16cid:durableId="145174869">
-    <w:abstractNumId w:val="8"/>
-  </w:num>
-  <w:num w:numId="18" w16cid:durableId="866261881">
-    <w:abstractNumId w:val="19"/>
-  </w:num>
-  <w:num w:numId="19" w16cid:durableId="170609978">
-    <w:abstractNumId w:val="4"/>
-  </w:num>
   <w:num w:numId="20" w16cid:durableId="148178343">
-    <w:abstractNumId w:val="23"/>
+    <w:abstractNumId w:val="36"/>
   </w:num>
   <w:num w:numId="21" w16cid:durableId="608198875">
-    <w:abstractNumId w:val="3"/>
+    <w:abstractNumId w:val="5"/>
   </w:num>
   <w:num w:numId="22" w16cid:durableId="840661452">
     <w:abstractNumId w:val="0"/>
   </w:num>
   <w:num w:numId="23" w16cid:durableId="452092848">
+    <w:abstractNumId w:val="33"/>
+  </w:num>
+  <w:num w:numId="24" w16cid:durableId="2132044651">
+    <w:abstractNumId w:val="15"/>
+  </w:num>
+  <w:num w:numId="25" w16cid:durableId="2001418186">
+    <w:abstractNumId w:val="13"/>
+  </w:num>
+  <w:num w:numId="26" w16cid:durableId="1442844410">
+    <w:abstractNumId w:val="24"/>
+  </w:num>
+  <w:num w:numId="27" w16cid:durableId="1751540226">
+    <w:abstractNumId w:val="21"/>
+  </w:num>
+  <w:num w:numId="28" w16cid:durableId="1716852349">
+    <w:abstractNumId w:val="22"/>
+  </w:num>
+  <w:num w:numId="29" w16cid:durableId="130827765">
+    <w:abstractNumId w:val="32"/>
+  </w:num>
+  <w:num w:numId="30" w16cid:durableId="1541747574">
+    <w:abstractNumId w:val="1"/>
+  </w:num>
+  <w:num w:numId="31" w16cid:durableId="4600593">
+    <w:abstractNumId w:val="38"/>
+  </w:num>
+  <w:num w:numId="32" w16cid:durableId="1139687128">
+    <w:abstractNumId w:val="30"/>
+  </w:num>
+  <w:num w:numId="33" w16cid:durableId="1463815270">
+    <w:abstractNumId w:val="6"/>
+  </w:num>
+  <w:num w:numId="34" w16cid:durableId="740324729">
+    <w:abstractNumId w:val="25"/>
+  </w:num>
+  <w:num w:numId="35" w16cid:durableId="751195059">
+    <w:abstractNumId w:val="39"/>
+  </w:num>
+  <w:num w:numId="36" w16cid:durableId="1535775275">
+    <w:abstractNumId w:val="19"/>
+  </w:num>
+  <w:num w:numId="37" w16cid:durableId="220218710">
     <w:abstractNumId w:val="20"/>
   </w:num>
-  <w:num w:numId="24" w16cid:durableId="2132044651">
-    <w:abstractNumId w:val="12"/>
+  <w:num w:numId="38" w16cid:durableId="579103585">
+    <w:abstractNumId w:val="17"/>
   </w:num>
-  <w:num w:numId="25" w16cid:durableId="2001418186">
-    <w:abstractNumId w:val="10"/>
+  <w:num w:numId="39" w16cid:durableId="128714348">
+    <w:abstractNumId w:val="18"/>
+  </w:num>
+  <w:num w:numId="40" w16cid:durableId="152457520">
+    <w:abstractNumId w:val="2"/>
   </w:num>
 </w:numbering>
 </file>

</xml_diff>